<commit_message>
Importing new objects and getting texture to apply
</commit_message>
<xml_diff>
--- a/Documentation/Initial Report.docx
+++ b/Documentation/Initial Report.docx
@@ -1,47 +1,25 @@
 
 <file path=word/document.xml><?xml version="1.0" encoding="utf-8"?>
-<w:document xmlns:wpc="http://schemas.microsoft.com/office/word/2010/wordprocessingCanvas" xmlns:cx="http://schemas.microsoft.com/office/drawing/2014/chartex" xmlns:cx1="http://schemas.microsoft.com/office/drawing/2015/9/8/chartex" xmlns:cx2="http://schemas.microsoft.com/office/drawing/2015/10/21/chartex" xmlns:cx3="http://schemas.microsoft.com/office/drawing/2016/5/9/chartex" xmlns:cx4="http://schemas.microsoft.com/office/drawing/2016/5/10/chartex" xmlns:cx5="http://schemas.microsoft.com/office/drawing/2016/5/11/chartex" xmlns:cx6="http://schemas.microsoft.com/office/drawing/2016/5/12/chartex" xmlns:cx7="http://schemas.microsoft.com/office/drawing/2016/5/13/chartex" xmlns:cx8="http://schemas.microsoft.com/office/drawing/2016/5/14/chartex" xmlns:mc="http://schemas.openxmlformats.org/markup-compatibility/2006" xmlns:aink="http://schemas.microsoft.com/office/drawing/2016/ink" xmlns:am3d="http://schemas.microsoft.com/office/drawing/2017/model3d" xmlns:o="urn:schemas-microsoft-com:office:office" xmlns:oel="http://schemas.microsoft.com/office/2019/extlst" xmlns:r="http://schemas.openxmlformats.org/officeDocument/2006/relationships" xmlns:m="http://schemas.openxmlformats.org/officeDocument/2006/math" xmlns:v="urn:schemas-microsoft-com:vml" xmlns:wp14="http://schemas.microsoft.com/office/word/2010/wordprocessingDrawing" xmlns:wp="http://schemas.openxmlformats.org/drawingml/2006/wordprocessingDrawing" xmlns:w10="urn:schemas-microsoft-com:office:word" xmlns:w="http://schemas.openxmlformats.org/wordprocessingml/2006/main" xmlns:w14="http://schemas.microsoft.com/office/word/2010/wordml" xmlns:w15="http://schemas.microsoft.com/office/word/2012/wordml" xmlns:w16cex="http://schemas.microsoft.com/office/word/2018/wordml/cex" xmlns:w16cid="http://schemas.microsoft.com/office/word/2016/wordml/cid" xmlns:w16="http://schemas.microsoft.com/office/word/2018/wordml" xmlns:w16du="http://schemas.microsoft.com/office/word/2023/wordml/word16du" xmlns:w16sdtdh="http://schemas.microsoft.com/office/word/2020/wordml/sdtdatahash" xmlns:w16sdtfl="http://schemas.microsoft.com/office/word/2024/wordml/sdtformatlock" xmlns:w16se="http://schemas.microsoft.com/office/word/2015/wordml/symex" xmlns:wpg="http://schemas.microsoft.com/office/word/2010/wordprocessingGroup" xmlns:wpi="http://schemas.microsoft.com/office/word/2010/wordprocessingInk" xmlns:wne="http://schemas.microsoft.com/office/word/2006/wordml" xmlns:wps="http://schemas.microsoft.com/office/word/2010/wordprocessingShape" xmlns:a="http://schemas.openxmlformats.org/drawingml/2006/main" xmlns:pic="http://schemas.openxmlformats.org/drawingml/2006/picture" xmlns:a14="http://schemas.microsoft.com/office/drawing/2010/main" mc:Ignorable="w14 w15 w16se w16cid w16 w16cex w16sdtdh w16sdtfl w16du wp14">
+<w:document xmlns:wpc="http://schemas.microsoft.com/office/word/2010/wordprocessingCanvas" xmlns:cx="http://schemas.microsoft.com/office/drawing/2014/chartex" xmlns:cx1="http://schemas.microsoft.com/office/drawing/2015/9/8/chartex" xmlns:cx2="http://schemas.microsoft.com/office/drawing/2015/10/21/chartex" xmlns:cx3="http://schemas.microsoft.com/office/drawing/2016/5/9/chartex" xmlns:cx4="http://schemas.microsoft.com/office/drawing/2016/5/10/chartex" xmlns:cx5="http://schemas.microsoft.com/office/drawing/2016/5/11/chartex" xmlns:cx6="http://schemas.microsoft.com/office/drawing/2016/5/12/chartex" xmlns:cx7="http://schemas.microsoft.com/office/drawing/2016/5/13/chartex" xmlns:cx8="http://schemas.microsoft.com/office/drawing/2016/5/14/chartex" xmlns:mc="http://schemas.openxmlformats.org/markup-compatibility/2006" xmlns:aink="http://schemas.microsoft.com/office/drawing/2016/ink" xmlns:am3d="http://schemas.microsoft.com/office/drawing/2017/model3d" xmlns:o="urn:schemas-microsoft-com:office:office" xmlns:oel="http://schemas.microsoft.com/office/2019/extlst" xmlns:r="http://schemas.openxmlformats.org/officeDocument/2006/relationships" xmlns:m="http://schemas.openxmlformats.org/officeDocument/2006/math" xmlns:v="urn:schemas-microsoft-com:vml" xmlns:wp14="http://schemas.microsoft.com/office/word/2010/wordprocessingDrawing" xmlns:wp="http://schemas.openxmlformats.org/drawingml/2006/wordprocessingDrawing" xmlns:w10="urn:schemas-microsoft-com:office:word" xmlns:w="http://schemas.openxmlformats.org/wordprocessingml/2006/main" xmlns:w14="http://schemas.microsoft.com/office/word/2010/wordml" xmlns:w15="http://schemas.microsoft.com/office/word/2012/wordml" xmlns:w16cex="http://schemas.microsoft.com/office/word/2018/wordml/cex" xmlns:w16cid="http://schemas.microsoft.com/office/word/2016/wordml/cid" xmlns:w16="http://schemas.microsoft.com/office/word/2018/wordml" xmlns:w16du="http://schemas.microsoft.com/office/word/2023/wordml/word16du" xmlns:w16sdtdh="http://schemas.microsoft.com/office/word/2020/wordml/sdtdatahash" xmlns:w16sdtfl="http://schemas.microsoft.com/office/word/2024/wordml/sdtformatlock" xmlns:w16se="http://schemas.microsoft.com/office/word/2015/wordml/symex" xmlns:wpg="http://schemas.microsoft.com/office/word/2010/wordprocessingGroup" xmlns:wpi="http://schemas.microsoft.com/office/word/2010/wordprocessingInk" xmlns:wne="http://schemas.microsoft.com/office/word/2006/wordml" xmlns:wps="http://schemas.microsoft.com/office/word/2010/wordprocessingShape" mc:Ignorable="w14 w15 w16se w16cid w16 w16cex w16sdtdh w16sdtfl w16du wp14">
   <w:body>
     <w:p>
       <w:pPr>
         <w:jc w:val="center"/>
         <w:rPr>
-          <w:b w:val="1"/>
-          <w:bCs w:val="1"/>
+          <w:b/>
+          <w:bCs/>
           <w:sz w:val="28"/>
           <w:szCs w:val="28"/>
-          <w:u w:val="none"/>
-        </w:rPr>
-      </w:pPr>
-      <w:r>
-        <w:rPr>
-          <w:b w:val="1"/>
-          <w:bCs w:val="1"/>
+        </w:rPr>
+      </w:pPr>
+      <w:r>
+        <w:rPr>
+          <w:b/>
+          <w:bCs/>
           <w:sz w:val="28"/>
           <w:szCs w:val="28"/>
-          <w:u w:val="none"/>
-        </w:rPr>
-        <w:t xml:space="preserve">Initial </w:t>
-      </w:r>
-      <w:r>
-        <w:rPr>
-          <w:b w:val="1"/>
-          <w:bCs w:val="1"/>
-          <w:sz w:val="28"/>
-          <w:szCs w:val="28"/>
-          <w:u w:val="none"/>
-        </w:rPr>
-        <w:t>Document</w:t>
-      </w:r>
-      <w:r>
-        <w:rPr>
-          <w:b w:val="1"/>
-          <w:bCs w:val="1"/>
-          <w:sz w:val="28"/>
-          <w:szCs w:val="28"/>
-          <w:u w:val="none"/>
-        </w:rPr>
-        <w:t xml:space="preserve"> </w:t>
+        </w:rPr>
+        <w:t xml:space="preserve">Initial Document </w:t>
       </w:r>
     </w:p>
     <w:p>
@@ -74,31 +52,33 @@
     </w:p>
     <w:p>
       <w:r>
-        <w:rPr/>
         <w:t>Objective is to create a project that showcases at least 2 of the above techniques combined into one efficient render pipeline. It is perfectly ok to use elements from the first submission (C1) as a start, but you need to show clear contribution beside that initial prototype.</w:t>
       </w:r>
     </w:p>
     <w:p>
       <w:r>
+        <w:rPr>
+          <w:noProof/>
+        </w:rPr>
         <w:drawing>
-          <wp:inline wp14:editId="455F3B75" wp14:anchorId="7BFEA2D5">
+          <wp:inline distT="0" distB="0" distL="0" distR="0" wp14:anchorId="7BFEA2D5" wp14:editId="455F3B75">
             <wp:extent cx="5724524" cy="1847850"/>
             <wp:effectExtent l="0" t="0" r="0" b="0"/>
-            <wp:docPr id="745250613" name="" title=""/>
+            <wp:docPr id="745250613" name="Picture 745250613"/>
             <wp:cNvGraphicFramePr>
-              <a:graphicFrameLocks noChangeAspect="1"/>
+              <a:graphicFrameLocks xmlns:a="http://schemas.openxmlformats.org/drawingml/2006/main" noChangeAspect="1"/>
             </wp:cNvGraphicFramePr>
-            <a:graphic>
+            <a:graphic xmlns:a="http://schemas.openxmlformats.org/drawingml/2006/main">
               <a:graphicData uri="http://schemas.openxmlformats.org/drawingml/2006/picture">
-                <pic:pic>
+                <pic:pic xmlns:pic="http://schemas.openxmlformats.org/drawingml/2006/picture">
                   <pic:nvPicPr>
                     <pic:cNvPr id="0" name=""/>
                     <pic:cNvPicPr/>
                   </pic:nvPicPr>
                   <pic:blipFill>
-                    <a:blip r:embed="R47645ec6a2dd4ff9">
-                      <a:extLst xmlns:a="http://schemas.openxmlformats.org/drawingml/2006/main">
-                        <a:ext xmlns:a="http://schemas.openxmlformats.org/drawingml/2006/main" uri="{28A0092B-C50C-407E-A947-70E740481C1C}">
+                    <a:blip r:embed="rId7">
+                      <a:extLst>
+                        <a:ext uri="{28A0092B-C50C-407E-A947-70E740481C1C}">
                           <a14:useLocalDpi xmlns:a14="http://schemas.microsoft.com/office/drawing/2010/main" val="0"/>
                         </a:ext>
                       </a:extLst>
@@ -107,12 +87,12 @@
                       <a:fillRect/>
                     </a:stretch>
                   </pic:blipFill>
-                  <pic:spPr xmlns:pic="http://schemas.openxmlformats.org/drawingml/2006/picture">
-                    <a:xfrm xmlns:a="http://schemas.openxmlformats.org/drawingml/2006/main" rot="0" flipH="0" flipV="0">
+                  <pic:spPr>
+                    <a:xfrm>
                       <a:off x="0" y="0"/>
                       <a:ext cx="5724524" cy="1847850"/>
                     </a:xfrm>
-                    <a:prstGeom xmlns:a="http://schemas.openxmlformats.org/drawingml/2006/main" prst="rect">
+                    <a:prstGeom prst="rect">
                       <a:avLst/>
                     </a:prstGeom>
                   </pic:spPr>
@@ -124,15 +104,31 @@
       </w:r>
     </w:p>
     <w:p>
-      <w:r>
-        <w:rPr/>
-        <w:t>So this is basically saying that 10 marks from 40 then 2 10 marks from this and its broken down like so</w:t>
-      </w:r>
-    </w:p>
-    <w:p>
-      <w:r>
-        <w:rPr/>
-        <w:t>So in total 3 - ^^^</w:t>
+      <w:proofErr w:type="gramStart"/>
+      <w:r>
+        <w:t>So</w:t>
+      </w:r>
+      <w:proofErr w:type="gramEnd"/>
+      <w:r>
+        <w:t xml:space="preserve"> this is basically saying that 10 marks from 40 then 2 10 marks from this and </w:t>
+      </w:r>
+      <w:proofErr w:type="gramStart"/>
+      <w:r>
+        <w:t>its</w:t>
+      </w:r>
+      <w:proofErr w:type="gramEnd"/>
+      <w:r>
+        <w:t xml:space="preserve"> broken down like so</w:t>
+      </w:r>
+    </w:p>
+    <w:p>
+      <w:proofErr w:type="gramStart"/>
+      <w:r>
+        <w:t>So</w:t>
+      </w:r>
+      <w:proofErr w:type="gramEnd"/>
+      <w:r>
+        <w:t xml:space="preserve"> in total 3 - ^^^</w:t>
       </w:r>
     </w:p>
     <w:p/>
@@ -181,26 +177,29 @@
     </w:p>
     <w:p>
       <w:r>
+        <w:rPr>
+          <w:noProof/>
+        </w:rPr>
         <w:drawing>
-          <wp:inline wp14:editId="1FCEBCF1" wp14:anchorId="7263CCA1">
+          <wp:inline distT="0" distB="0" distL="0" distR="0" wp14:anchorId="7263CCA1" wp14:editId="1213866F">
             <wp:extent cx="3458817" cy="1870045"/>
             <wp:effectExtent l="0" t="0" r="8890" b="0"/>
-            <wp:docPr id="1402159088" name="Picture 1" descr="A drawing of a table and chairs&#10;&#10;AI-generated content may be incorrect." title=""/>
+            <wp:docPr id="1402159088" name="Picture 1" descr="A drawing of a table and chairs&#10;&#10;AI-generated content may be incorrect."/>
             <wp:cNvGraphicFramePr>
-              <a:graphicFrameLocks noChangeAspect="1"/>
+              <a:graphicFrameLocks xmlns:a="http://schemas.openxmlformats.org/drawingml/2006/main" noChangeAspect="1"/>
             </wp:cNvGraphicFramePr>
-            <a:graphic>
+            <a:graphic xmlns:a="http://schemas.openxmlformats.org/drawingml/2006/main">
               <a:graphicData uri="http://schemas.openxmlformats.org/drawingml/2006/picture">
-                <pic:pic>
+                <pic:pic xmlns:pic="http://schemas.openxmlformats.org/drawingml/2006/picture">
                   <pic:nvPicPr>
                     <pic:cNvPr id="0" name="Picture 1"/>
                     <pic:cNvPicPr/>
                   </pic:nvPicPr>
                   <pic:blipFill>
-                    <a:blip r:embed="R3142fe3c35684b76">
+                    <a:blip r:embed="rId8" cstate="print">
                       <a:extLst>
-                        <a:ext xmlns:a="http://schemas.openxmlformats.org/drawingml/2006/main" uri="{28A0092B-C50C-407E-A947-70E740481C1C}">
-                          <a14:useLocalDpi val="0"/>
+                        <a:ext uri="{28A0092B-C50C-407E-A947-70E740481C1C}">
+                          <a14:useLocalDpi xmlns:a14="http://schemas.microsoft.com/office/drawing/2010/main" val="0"/>
                         </a:ext>
                       </a:extLst>
                     </a:blip>
@@ -209,7 +208,7 @@
                     </a:stretch>
                   </pic:blipFill>
                   <pic:spPr>
-                    <a:xfrm rot="0" flipH="0" flipV="0">
+                    <a:xfrm>
                       <a:off x="0" y="0"/>
                       <a:ext cx="3458817" cy="1870045"/>
                     </a:xfrm>
@@ -227,50 +226,50 @@
     <w:p>
       <w:pPr>
         <w:rPr>
-          <w:b w:val="1"/>
-          <w:bCs w:val="1"/>
-        </w:rPr>
-      </w:pPr>
-    </w:p>
-    <w:p>
-      <w:pPr>
-        <w:rPr>
-          <w:b w:val="1"/>
-          <w:bCs w:val="1"/>
-        </w:rPr>
-      </w:pPr>
-      <w:r>
-        <w:rPr>
-          <w:b w:val="1"/>
-          <w:bCs w:val="1"/>
+          <w:b/>
+          <w:bCs/>
+        </w:rPr>
+      </w:pPr>
+    </w:p>
+    <w:p>
+      <w:pPr>
+        <w:rPr>
+          <w:b/>
+          <w:bCs/>
+        </w:rPr>
+      </w:pPr>
+      <w:r>
+        <w:rPr>
+          <w:b/>
+          <w:bCs/>
         </w:rPr>
         <w:t xml:space="preserve">The </w:t>
       </w:r>
       <w:r>
         <w:rPr>
-          <w:b w:val="1"/>
-          <w:bCs w:val="1"/>
+          <w:b/>
+          <w:bCs/>
         </w:rPr>
         <w:t>3</w:t>
       </w:r>
       <w:r>
         <w:rPr>
-          <w:b w:val="1"/>
-          <w:bCs w:val="1"/>
+          <w:b/>
+          <w:bCs/>
         </w:rPr>
         <w:t xml:space="preserve"> Techniques I chose</w:t>
       </w:r>
       <w:r>
         <w:rPr>
-          <w:b w:val="1"/>
-          <w:bCs w:val="1"/>
+          <w:b/>
+          <w:bCs/>
         </w:rPr>
         <w:t>:</w:t>
       </w:r>
       <w:r>
         <w:rPr>
-          <w:b w:val="1"/>
-          <w:bCs w:val="1"/>
+          <w:b/>
+          <w:bCs/>
         </w:rPr>
         <w:t xml:space="preserve"> </w:t>
       </w:r>
@@ -280,59 +279,26 @@
         <w:pStyle w:val="ListParagraph"/>
         <w:numPr>
           <w:ilvl w:val="0"/>
-          <w:numId w:val="3"/>
+          <w:numId w:val="1"/>
         </w:numPr>
-        <w:rPr>
-          <w:noProof w:val="0"/>
-          <w:lang w:val="en-GB"/>
-        </w:rPr>
-      </w:pPr>
-      <w:r>
-        <w:rPr>
-          <w:sz w:val="22"/>
-          <w:szCs w:val="22"/>
-        </w:rPr>
+      </w:pPr>
+      <w:r>
         <w:t xml:space="preserve">Week 5 - </w:t>
       </w:r>
       <w:r>
         <w:rPr>
-          <w:b w:val="1"/>
-          <w:bCs w:val="1"/>
-          <w:noProof w:val="0"/>
-          <w:lang w:val="en-GB"/>
+          <w:b/>
+          <w:bCs/>
         </w:rPr>
         <w:t>Bloom Effect</w:t>
       </w:r>
       <w:r>
-        <w:rPr>
-          <w:noProof w:val="0"/>
-          <w:lang w:val="en-GB"/>
-        </w:rPr>
-        <w:t xml:space="preserve"> – Simulates bright light bleeding into adjacent areas, creating a glowing effect – </w:t>
-      </w:r>
-      <w:r>
-        <w:rPr>
-          <w:noProof w:val="0"/>
-          <w:lang w:val="en-GB"/>
-        </w:rPr>
-        <w:t>Maybe use</w:t>
-      </w:r>
-      <w:r>
-        <w:rPr>
-          <w:noProof w:val="0"/>
-          <w:lang w:val="en-GB"/>
-        </w:rPr>
-        <w:t xml:space="preserve"> this for inside can or something </w:t>
+        <w:t xml:space="preserve"> – Simulates bright light bleeding into adjacent areas, creating a glowing effect – Maybe use this for inside can or something </w:t>
       </w:r>
     </w:p>
     <w:p>
       <w:pPr>
         <w:pStyle w:val="ListParagraph"/>
-        <w:ind w:left="720"/>
-        <w:rPr>
-          <w:noProof w:val="0"/>
-          <w:lang w:val="en-GB"/>
-        </w:rPr>
       </w:pPr>
     </w:p>
     <w:p>
@@ -340,68 +306,36 @@
         <w:pStyle w:val="ListParagraph"/>
         <w:numPr>
           <w:ilvl w:val="0"/>
-          <w:numId w:val="3"/>
+          <w:numId w:val="1"/>
         </w:numPr>
-        <w:rPr>
-          <w:sz w:val="22"/>
-          <w:szCs w:val="22"/>
-        </w:rPr>
-      </w:pPr>
-      <w:r>
-        <w:rPr>
-          <w:rFonts w:ascii="Aptos" w:hAnsi="Aptos" w:eastAsia="Aptos" w:cs="Aptos"/>
-          <w:noProof w:val="0"/>
-          <w:sz w:val="22"/>
-          <w:szCs w:val="22"/>
-          <w:lang w:val="en-GB"/>
+      </w:pPr>
+      <w:r>
+        <w:rPr>
+          <w:rFonts w:ascii="Aptos" w:eastAsia="Aptos" w:hAnsi="Aptos" w:cs="Aptos"/>
         </w:rPr>
         <w:t xml:space="preserve">Week 7 - </w:t>
       </w:r>
       <w:r>
         <w:rPr>
-          <w:rFonts w:ascii="Aptos" w:hAnsi="Aptos" w:eastAsia="Aptos" w:cs="Aptos"/>
-          <w:b w:val="1"/>
-          <w:bCs w:val="1"/>
-          <w:noProof w:val="0"/>
-          <w:sz w:val="22"/>
-          <w:szCs w:val="22"/>
-          <w:lang w:val="en-GB"/>
+          <w:rFonts w:ascii="Aptos" w:eastAsia="Aptos" w:hAnsi="Aptos" w:cs="Aptos"/>
+          <w:b/>
+          <w:bCs/>
         </w:rPr>
         <w:t>Vertex Animations</w:t>
       </w:r>
       <w:r>
         <w:rPr>
-          <w:rFonts w:ascii="Aptos" w:hAnsi="Aptos" w:eastAsia="Aptos" w:cs="Aptos"/>
-          <w:noProof w:val="0"/>
-          <w:sz w:val="22"/>
-          <w:szCs w:val="22"/>
-          <w:lang w:val="en-GB"/>
-        </w:rPr>
-        <w:t xml:space="preserve"> - Fire/Smoke Particles </w:t>
-      </w:r>
-      <w:r>
-        <w:rPr>
-          <w:rFonts w:ascii="Aptos" w:hAnsi="Aptos" w:eastAsia="Aptos" w:cs="Aptos"/>
-          <w:noProof w:val="0"/>
-          <w:sz w:val="22"/>
-          <w:szCs w:val="22"/>
-          <w:lang w:val="en-GB"/>
-        </w:rPr>
-        <w:t>(Fire</w:t>
-      </w:r>
-      <w:r>
-        <w:rPr/>
+          <w:rFonts w:ascii="Aptos" w:eastAsia="Aptos" w:hAnsi="Aptos" w:cs="Aptos"/>
+        </w:rPr>
+        <w:t xml:space="preserve"> - Fire/Smoke Particles (Fire</w:t>
+      </w:r>
+      <w:r>
         <w:t>/smoke could enhance the broken wall for a more dynamic look)</w:t>
       </w:r>
     </w:p>
     <w:p>
       <w:pPr>
         <w:pStyle w:val="ListParagraph"/>
-        <w:ind w:left="720"/>
-        <w:rPr>
-          <w:sz w:val="22"/>
-          <w:szCs w:val="22"/>
-        </w:rPr>
       </w:pPr>
     </w:p>
     <w:p>
@@ -409,133 +343,100 @@
         <w:pStyle w:val="ListParagraph"/>
         <w:numPr>
           <w:ilvl w:val="0"/>
-          <w:numId w:val="3"/>
+          <w:numId w:val="1"/>
         </w:numPr>
-        <w:rPr>
-          <w:sz w:val="22"/>
-          <w:szCs w:val="22"/>
-        </w:rPr>
-      </w:pPr>
-      <w:r>
-        <w:rPr>
-          <w:sz w:val="22"/>
-          <w:szCs w:val="22"/>
-        </w:rPr>
+      </w:pPr>
+      <w:r>
         <w:t xml:space="preserve">Week 10 – </w:t>
       </w:r>
       <w:r>
         <w:rPr>
-          <w:b w:val="1"/>
-          <w:bCs w:val="1"/>
-          <w:sz w:val="22"/>
-          <w:szCs w:val="22"/>
+          <w:b/>
+          <w:bCs/>
         </w:rPr>
         <w:t>PBR</w:t>
       </w:r>
       <w:r>
-        <w:rPr>
-          <w:sz w:val="22"/>
-          <w:szCs w:val="22"/>
-        </w:rPr>
         <w:t xml:space="preserve"> - Add metal Gun Shine, Or Can idk</w:t>
       </w:r>
     </w:p>
     <w:p>
       <w:pPr>
         <w:pStyle w:val="ListParagraph"/>
-        <w:ind w:left="720"/>
-        <w:rPr>
-          <w:sz w:val="22"/>
-          <w:szCs w:val="22"/>
-        </w:rPr>
-      </w:pPr>
-    </w:p>
-    <w:p>
-      <w:pPr>
-        <w:ind w:left="0"/>
-        <w:rPr>
-          <w:b w:val="1"/>
-          <w:bCs w:val="1"/>
-        </w:rPr>
-      </w:pPr>
-      <w:r>
-        <w:rPr>
-          <w:b w:val="1"/>
-          <w:bCs w:val="1"/>
+      </w:pPr>
+    </w:p>
+    <w:p>
+      <w:pPr>
+        <w:rPr>
+          <w:b/>
+          <w:bCs/>
+        </w:rPr>
+      </w:pPr>
+      <w:r>
+        <w:rPr>
+          <w:b/>
+          <w:bCs/>
         </w:rPr>
         <w:t xml:space="preserve">How to </w:t>
       </w:r>
       <w:r>
         <w:rPr>
-          <w:b w:val="1"/>
-          <w:bCs w:val="1"/>
+          <w:b/>
+          <w:bCs/>
         </w:rPr>
         <w:t>Gamify</w:t>
       </w:r>
       <w:r>
         <w:rPr>
-          <w:b w:val="1"/>
-          <w:bCs w:val="1"/>
+          <w:b/>
+          <w:bCs/>
         </w:rPr>
         <w:t xml:space="preserve"> it</w:t>
       </w:r>
       <w:r>
         <w:rPr>
-          <w:b w:val="1"/>
-          <w:bCs w:val="1"/>
+          <w:b/>
+          <w:bCs/>
         </w:rPr>
         <w:t>:</w:t>
       </w:r>
     </w:p>
     <w:p>
       <w:r>
-        <w:rPr/>
         <w:t xml:space="preserve">If </w:t>
       </w:r>
-      <w:r>
-        <w:rPr/>
+      <w:proofErr w:type="spellStart"/>
+      <w:r>
         <w:t>i</w:t>
       </w:r>
-      <w:r>
-        <w:rPr/>
+      <w:proofErr w:type="spellEnd"/>
+      <w:r>
         <w:t xml:space="preserve"> am using the gun for </w:t>
       </w:r>
-      <w:r>
-        <w:rPr/>
+      <w:proofErr w:type="gramStart"/>
+      <w:r>
         <w:t>game</w:t>
       </w:r>
-      <w:r>
-        <w:rPr/>
+      <w:proofErr w:type="gramEnd"/>
+      <w:r>
         <w:t xml:space="preserve"> then maybe make the can shiny instead</w:t>
       </w:r>
     </w:p>
     <w:p>
       <w:r>
-        <w:rPr/>
-        <w:t xml:space="preserve">I think </w:t>
-      </w:r>
-      <w:r>
-        <w:rPr/>
-        <w:t>maybe shooting</w:t>
-      </w:r>
-      <w:r>
-        <w:rPr/>
-        <w:t xml:space="preserve"> cans??</w:t>
-      </w:r>
-    </w:p>
-    <w:p>
-      <w:r>
-        <w:rPr/>
+        <w:t>I think maybe shooting cans??</w:t>
+      </w:r>
+    </w:p>
+    <w:p>
+      <w:r>
         <w:t>Maybe shooting the robot heads in back and score goes up – Timer with fog coming to fill out screen?</w:t>
       </w:r>
     </w:p>
     <w:p>
       <w:pPr>
-        <w:pStyle w:val="Normal"/>
-        <w:ind w:left="0"/>
-        <w:rPr>
-          <w:b w:val="1"/>
-          <w:bCs w:val="1"/>
+        <w:rPr>
+          <w:b/>
+          <w:bCs/>
         </w:rPr>
       </w:pPr>
     </w:p>
@@ -543,27 +444,22 @@
     <w:p/>
     <w:p>
       <w:r>
-        <w:rPr/>
         <w:t>You may use any from any sources (i.e. “</w:t>
       </w:r>
-      <w:r>
-        <w:rPr/>
+      <w:proofErr w:type="spellStart"/>
+      <w:r>
         <w:t>gamedev</w:t>
       </w:r>
-      <w:r>
-        <w:rPr/>
-        <w:t>”,</w:t>
-      </w:r>
-      <w:r>
-        <w:rPr/>
-        <w:t xml:space="preserve"> Nvidia, </w:t>
-      </w:r>
-      <w:r>
-        <w:rPr/>
+      <w:proofErr w:type="spellEnd"/>
+      <w:r>
+        <w:t xml:space="preserve">”, Nvidia, </w:t>
+      </w:r>
+      <w:proofErr w:type="spellStart"/>
+      <w:r>
         <w:t>Shadertoy</w:t>
       </w:r>
-      <w:r>
-        <w:rPr/>
+      <w:proofErr w:type="spellEnd"/>
+      <w:r>
         <w:t xml:space="preserve">) of program code which you can adapt. But you must tell us what you started with and what you have done to it. If this is not done you risk failing the assignment. You can also use a wider range of 3rd party libraries this time around, e.g. audio, noise, UI. You could also use a physics library such as a </w:t>
       </w:r>
       <w:r>
@@ -583,15 +479,15 @@
     <w:p>
       <w:pPr>
         <w:rPr>
-          <w:b w:val="1"/>
-          <w:bCs w:val="1"/>
+          <w:b/>
+          <w:bCs/>
           <w:u w:val="single"/>
         </w:rPr>
       </w:pPr>
       <w:r>
         <w:rPr>
-          <w:b w:val="1"/>
-          <w:bCs w:val="1"/>
+          <w:b/>
+          <w:bCs/>
           <w:u w:val="single"/>
         </w:rPr>
         <w:t>Assets:</w:t>
@@ -600,218 +496,119 @@
     <w:p>
       <w:pPr>
         <w:rPr>
-          <w:b w:val="1"/>
-          <w:bCs w:val="1"/>
+          <w:b/>
+          <w:bCs/>
           <w:u w:val="single"/>
         </w:rPr>
       </w:pPr>
       <w:r>
         <w:rPr>
-          <w:b w:val="1"/>
-          <w:bCs w:val="1"/>
+          <w:b/>
+          <w:bCs/>
           <w:u w:val="single"/>
         </w:rPr>
         <w:t>Models</w:t>
       </w:r>
     </w:p>
     <w:p>
-      <w:pPr>
-        <w:rPr>
-          <w:b w:val="0"/>
-          <w:bCs w:val="0"/>
-          <w:u w:val="none"/>
-        </w:rPr>
-      </w:pPr>
-      <w:r>
-        <w:rPr>
-          <w:b w:val="0"/>
-          <w:bCs w:val="0"/>
-          <w:u w:val="none"/>
-        </w:rPr>
+      <w:r>
         <w:t xml:space="preserve">Table - </w:t>
       </w:r>
-      <w:hyperlink r:id="Rbee0528e42b34048">
+      <w:hyperlink r:id="rId9">
         <w:r>
           <w:rPr>
             <w:rStyle w:val="Hyperlink"/>
-            <w:b w:val="0"/>
-            <w:bCs w:val="0"/>
           </w:rPr>
           <w:t>https://www.turbosquid.com/3d-models/low-poly-wooden-table-516990</w:t>
         </w:r>
       </w:hyperlink>
       <w:r>
-        <w:rPr>
-          <w:b w:val="0"/>
-          <w:bCs w:val="0"/>
-          <w:u w:val="none"/>
-        </w:rPr>
         <w:t xml:space="preserve"> OR </w:t>
       </w:r>
     </w:p>
     <w:p>
-      <w:pPr>
-        <w:rPr>
-          <w:b w:val="0"/>
-          <w:bCs w:val="0"/>
-          <w:u w:val="none"/>
-        </w:rPr>
-      </w:pPr>
-      <w:r>
-        <w:rPr>
-          <w:b w:val="0"/>
-          <w:bCs w:val="0"/>
-          <w:u w:val="none"/>
-        </w:rPr>
+      <w:r>
         <w:t xml:space="preserve"> - </w:t>
       </w:r>
-      <w:hyperlink r:id="Rc49fcd389e47408d">
+      <w:hyperlink r:id="rId10">
         <w:r>
           <w:rPr>
             <w:rStyle w:val="Hyperlink"/>
-            <w:b w:val="0"/>
-            <w:bCs w:val="0"/>
           </w:rPr>
           <w:t>https://www.turbosquid.com/3d-models/old-table-936055</w:t>
         </w:r>
       </w:hyperlink>
     </w:p>
     <w:p>
-      <w:pPr>
-        <w:rPr>
-          <w:b w:val="0"/>
-          <w:bCs w:val="0"/>
-          <w:u w:val="none"/>
-        </w:rPr>
-      </w:pPr>
-      <w:r>
-        <w:rPr>
-          <w:b w:val="0"/>
-          <w:bCs w:val="0"/>
-          <w:u w:val="none"/>
-        </w:rPr>
+      <w:r>
         <w:t>Can – Already got</w:t>
       </w:r>
     </w:p>
     <w:p>
-      <w:pPr>
-        <w:rPr>
-          <w:b w:val="0"/>
-          <w:bCs w:val="0"/>
-          <w:u w:val="none"/>
-        </w:rPr>
-      </w:pPr>
-      <w:r>
-        <w:rPr>
-          <w:b w:val="0"/>
-          <w:bCs w:val="0"/>
-          <w:u w:val="none"/>
-        </w:rPr>
+      <w:r>
         <w:t xml:space="preserve">Wall - </w:t>
       </w:r>
-      <w:hyperlink r:id="R2abe985d70994cc7">
+      <w:hyperlink r:id="rId11">
         <w:r>
           <w:rPr>
             <w:rStyle w:val="Hyperlink"/>
-            <w:b w:val="0"/>
-            <w:bCs w:val="0"/>
           </w:rPr>
-          <w:t>https://www.turbosquid.com/3d-models/wall-747378</w:t>
+          <w:t>https://www.</w:t>
         </w:r>
-      </w:hyperlink>
-    </w:p>
-    <w:p>
-      <w:pPr>
-        <w:rPr>
-          <w:b w:val="0"/>
-          <w:bCs w:val="0"/>
-          <w:u w:val="none"/>
-        </w:rPr>
-      </w:pPr>
-      <w:r>
-        <w:rPr>
-          <w:b w:val="0"/>
-          <w:bCs w:val="0"/>
-          <w:u w:val="none"/>
-        </w:rPr>
-        <w:t>Gun</w:t>
-      </w:r>
-      <w:r>
-        <w:rPr>
-          <w:b w:val="0"/>
-          <w:bCs w:val="0"/>
-          <w:u w:val="none"/>
-        </w:rPr>
-        <w:t xml:space="preserve"> – Fallout gun -  </w:t>
-      </w:r>
-      <w:hyperlink r:id="R7f9df9ce38b74746">
         <w:r>
           <w:rPr>
             <w:rStyle w:val="Hyperlink"/>
-            <w:b w:val="0"/>
-            <w:bCs w:val="0"/>
+          </w:rPr>
+          <w:t>t</w:t>
+        </w:r>
+        <w:r>
+          <w:rPr>
+            <w:rStyle w:val="Hyperlink"/>
+          </w:rPr>
+          <w:t>urbosquid.com/3d-models/wall-747378</w:t>
+        </w:r>
+      </w:hyperlink>
+    </w:p>
+    <w:p>
+      <w:r>
+        <w:t>Gun</w:t>
+      </w:r>
+      <w:r>
+        <w:t xml:space="preserve"> – Fallout gun -  </w:t>
+      </w:r>
+      <w:hyperlink r:id="rId12">
+        <w:r>
+          <w:rPr>
+            <w:rStyle w:val="Hyperlink"/>
           </w:rPr>
           <w:t>https://www.turbosquid.com/3d-models/pistol-vintage-sci-fi-1644585</w:t>
         </w:r>
       </w:hyperlink>
     </w:p>
     <w:p>
-      <w:pPr>
-        <w:rPr>
-          <w:b w:val="0"/>
-          <w:bCs w:val="0"/>
-          <w:u w:val="none"/>
-        </w:rPr>
-      </w:pPr>
-      <w:r>
-        <w:rPr>
-          <w:b w:val="0"/>
-          <w:bCs w:val="0"/>
-          <w:u w:val="none"/>
-        </w:rPr>
+      <w:r>
         <w:t xml:space="preserve">            Backup Gun - </w:t>
       </w:r>
       <w:r>
-        <w:rPr>
-          <w:b w:val="0"/>
-          <w:bCs w:val="0"/>
-          <w:u w:val="none"/>
-        </w:rPr>
         <w:t xml:space="preserve"> </w:t>
       </w:r>
-      <w:hyperlink r:id="Rcbe240f4d6af45a4">
+      <w:hyperlink r:id="rId13">
         <w:r>
           <w:rPr>
             <w:rStyle w:val="Hyperlink"/>
-            <w:b w:val="0"/>
-            <w:bCs w:val="0"/>
           </w:rPr>
           <w:t>https://www.turbosquid.com/3d-models/beretta-m9-low-poly-pbr-free-1778299</w:t>
         </w:r>
       </w:hyperlink>
     </w:p>
     <w:p>
-      <w:pPr>
-        <w:rPr>
-          <w:b w:val="0"/>
-          <w:bCs w:val="0"/>
-          <w:u w:val="none"/>
-        </w:rPr>
-      </w:pPr>
-      <w:r>
-        <w:rPr>
-          <w:b w:val="0"/>
-          <w:bCs w:val="0"/>
-          <w:u w:val="none"/>
-        </w:rPr>
+      <w:r>
         <w:t xml:space="preserve">This could be in background - </w:t>
       </w:r>
-      <w:hyperlink r:id="R506c98e1b7cd4e82">
+      <w:hyperlink r:id="rId14">
         <w:r>
           <w:rPr>
             <w:rStyle w:val="Hyperlink"/>
-            <w:b w:val="0"/>
-            <w:bCs w:val="0"/>
           </w:rPr>
           <w:t>https://www.turbosquid.com/3d-models/scifi-913160</w:t>
         </w:r>
@@ -820,107 +617,67 @@
     <w:p>
       <w:pPr>
         <w:rPr>
-          <w:b w:val="1"/>
-          <w:bCs w:val="1"/>
+          <w:b/>
+          <w:bCs/>
           <w:u w:val="single"/>
         </w:rPr>
       </w:pPr>
       <w:r>
         <w:rPr>
-          <w:b w:val="1"/>
-          <w:bCs w:val="1"/>
+          <w:b/>
+          <w:bCs/>
           <w:u w:val="single"/>
         </w:rPr>
         <w:t>Audio</w:t>
       </w:r>
     </w:p>
     <w:p>
-      <w:pPr>
-        <w:rPr>
-          <w:b w:val="0"/>
-          <w:bCs w:val="0"/>
-          <w:u w:val="none"/>
-        </w:rPr>
-      </w:pPr>
-      <w:r>
-        <w:rPr>
-          <w:b w:val="0"/>
-          <w:bCs w:val="0"/>
-          <w:u w:val="none"/>
-        </w:rPr>
-        <w:t xml:space="preserve">Probably irrklang </w:t>
-      </w:r>
-    </w:p>
-    <w:p>
-      <w:pPr>
-        <w:rPr>
-          <w:b w:val="0"/>
-          <w:bCs w:val="0"/>
-        </w:rPr>
-      </w:pPr>
-    </w:p>
-    <w:p>
-      <w:pPr>
-        <w:rPr>
-          <w:b w:val="1"/>
-          <w:bCs w:val="1"/>
+      <w:r>
+        <w:t xml:space="preserve">Probably </w:t>
+      </w:r>
+      <w:proofErr w:type="spellStart"/>
+      <w:r>
+        <w:t>irrklang</w:t>
+      </w:r>
+      <w:proofErr w:type="spellEnd"/>
+      <w:r>
+        <w:t xml:space="preserve"> </w:t>
+      </w:r>
+    </w:p>
+    <w:p/>
+    <w:p>
+      <w:pPr>
+        <w:rPr>
+          <w:b/>
+          <w:bCs/>
           <w:u w:val="single"/>
         </w:rPr>
       </w:pPr>
       <w:r>
         <w:rPr>
-          <w:b w:val="1"/>
-          <w:bCs w:val="1"/>
+          <w:b/>
+          <w:bCs/>
           <w:u w:val="single"/>
         </w:rPr>
         <w:t>UI</w:t>
       </w:r>
     </w:p>
     <w:p>
-      <w:pPr>
-        <w:rPr>
-          <w:b w:val="0"/>
-          <w:bCs w:val="0"/>
-          <w:u w:val="none"/>
-        </w:rPr>
-      </w:pPr>
-      <w:r>
-        <w:rPr>
-          <w:b w:val="0"/>
-          <w:bCs w:val="0"/>
-          <w:u w:val="none"/>
-        </w:rPr>
-        <w:t xml:space="preserve">Probably </w:t>
-      </w:r>
-      <w:r>
-        <w:rPr>
-          <w:b w:val="0"/>
-          <w:bCs w:val="0"/>
-          <w:u w:val="none"/>
-        </w:rPr>
-        <w:t>Inkscape</w:t>
-      </w:r>
-    </w:p>
-    <w:p>
-      <w:pPr>
-        <w:rPr>
-          <w:b w:val="1"/>
-          <w:bCs w:val="1"/>
+      <w:r>
+        <w:t>Probably Inkscape</w:t>
+      </w:r>
+    </w:p>
+    <w:p>
+      <w:pPr>
+        <w:rPr>
+          <w:b/>
+          <w:bCs/>
           <w:u w:val="single"/>
         </w:rPr>
       </w:pPr>
     </w:p>
-    <w:p>
-      <w:pPr>
-        <w:pStyle w:val="Normal"/>
-        <w:rPr>
-          <w:b w:val="0"/>
-          <w:bCs w:val="0"/>
-          <w:u w:val="none"/>
-        </w:rPr>
-      </w:pPr>
-    </w:p>
     <w:p/>
+    <w:p/>
     <w:p>
       <w:pPr>
         <w:rPr>
@@ -931,44 +688,16 @@
       </w:pPr>
       <w:r>
         <w:rPr>
-          <w:b w:val="1"/>
-          <w:bCs w:val="1"/>
+          <w:b/>
+          <w:bCs/>
           <w:u w:val="single"/>
         </w:rPr>
         <w:t>What I started with:</w:t>
       </w:r>
     </w:p>
     <w:p>
-      <w:pPr>
-        <w:rPr>
-          <w:b w:val="0"/>
-          <w:bCs w:val="0"/>
-          <w:u w:val="none"/>
-        </w:rPr>
-      </w:pPr>
-      <w:r>
-        <w:rPr>
-          <w:b w:val="0"/>
-          <w:bCs w:val="0"/>
-          <w:u w:val="none"/>
-        </w:rPr>
-        <w:t xml:space="preserve">Load the </w:t>
-      </w:r>
-      <w:r>
-        <w:rPr>
-          <w:b w:val="0"/>
-          <w:bCs w:val="0"/>
-          <w:u w:val="none"/>
-        </w:rPr>
-        <w:t>assets ,</w:t>
-      </w:r>
-      <w:r>
-        <w:rPr>
-          <w:b w:val="0"/>
-          <w:bCs w:val="0"/>
-          <w:u w:val="none"/>
-        </w:rPr>
-        <w:t xml:space="preserve"> Load the textures, Movement </w:t>
+      <w:r>
+        <w:t xml:space="preserve">Load the assets , Load the textures, Movement </w:t>
       </w:r>
     </w:p>
     <w:p/>
@@ -984,6 +713,9 @@
     </w:p>
     <w:p>
       <w:r>
+        <w:rPr>
+          <w:noProof/>
+        </w:rPr>
         <w:drawing>
           <wp:inline distT="0" distB="0" distL="0" distR="0" wp14:anchorId="795E02D6" wp14:editId="61CCEAC7">
             <wp:extent cx="5731510" cy="1911985"/>
@@ -1000,7 +732,7 @@
                     <pic:cNvPicPr/>
                   </pic:nvPicPr>
                   <pic:blipFill>
-                    <a:blip r:embed="rId6"/>
+                    <a:blip r:embed="rId15"/>
                     <a:stretch>
                       <a:fillRect/>
                     </a:stretch>
@@ -1026,32 +758,110 @@
         <w:pStyle w:val="ListParagraph"/>
         <w:numPr>
           <w:ilvl w:val="0"/>
-          <w:numId w:val="1"/>
+          <w:numId w:val="2"/>
         </w:numPr>
       </w:pPr>
       <w:r>
         <w:t>Need to make sure I have more items and fix skybox</w:t>
       </w:r>
     </w:p>
-    <w:p/>
+    <w:p>
+      <w:r>
+        <w:rPr>
+          <w:noProof/>
+        </w:rPr>
+        <w:lastRenderedPageBreak/>
+        <w:drawing>
+          <wp:inline distT="0" distB="0" distL="0" distR="0" wp14:anchorId="6A563B8B" wp14:editId="10F7843D">
+            <wp:extent cx="5731510" cy="5475605"/>
+            <wp:effectExtent l="0" t="0" r="2540" b="0"/>
+            <wp:docPr id="76264263" name="Picture 1" descr="A screenshot of a computer program&#10;&#10;AI-generated content may be incorrect."/>
+            <wp:cNvGraphicFramePr>
+              <a:graphicFrameLocks xmlns:a="http://schemas.openxmlformats.org/drawingml/2006/main" noChangeAspect="1"/>
+            </wp:cNvGraphicFramePr>
+            <a:graphic xmlns:a="http://schemas.openxmlformats.org/drawingml/2006/main">
+              <a:graphicData uri="http://schemas.openxmlformats.org/drawingml/2006/picture">
+                <pic:pic xmlns:pic="http://schemas.openxmlformats.org/drawingml/2006/picture">
+                  <pic:nvPicPr>
+                    <pic:cNvPr id="76264263" name="Picture 1" descr="A screenshot of a computer program&#10;&#10;AI-generated content may be incorrect."/>
+                    <pic:cNvPicPr>
+                      <a:picLocks noChangeAspect="1" noChangeArrowheads="1"/>
+                    </pic:cNvPicPr>
+                  </pic:nvPicPr>
+                  <pic:blipFill>
+                    <a:blip r:embed="rId16">
+                      <a:extLst>
+                        <a:ext uri="{28A0092B-C50C-407E-A947-70E740481C1C}">
+                          <a14:useLocalDpi xmlns:a14="http://schemas.microsoft.com/office/drawing/2010/main" val="0"/>
+                        </a:ext>
+                      </a:extLst>
+                    </a:blip>
+                    <a:srcRect/>
+                    <a:stretch>
+                      <a:fillRect/>
+                    </a:stretch>
+                  </pic:blipFill>
+                  <pic:spPr bwMode="auto">
+                    <a:xfrm>
+                      <a:off x="0" y="0"/>
+                      <a:ext cx="5731510" cy="5475605"/>
+                    </a:xfrm>
+                    <a:prstGeom prst="rect">
+                      <a:avLst/>
+                    </a:prstGeom>
+                    <a:noFill/>
+                    <a:ln>
+                      <a:noFill/>
+                    </a:ln>
+                  </pic:spPr>
+                </pic:pic>
+              </a:graphicData>
+            </a:graphic>
+          </wp:inline>
+        </w:drawing>
+      </w:r>
+    </w:p>
     <w:sectPr>
-      <w:pgSz w:w="11906" w:h="16838" w:orient="portrait"/>
+      <w:headerReference w:type="default" r:id="rId17"/>
+      <w:footerReference w:type="default" r:id="rId18"/>
+      <w:pgSz w:w="11906" w:h="16838"/>
       <w:pgMar w:top="1440" w:right="1440" w:bottom="1440" w:left="1440" w:header="708" w:footer="708" w:gutter="0"/>
       <w:cols w:space="708"/>
       <w:docGrid w:linePitch="360"/>
-      <w:headerReference w:type="default" r:id="Rf2ebdcf45d354d3a"/>
-      <w:footerReference w:type="default" r:id="R269353de05884c37"/>
     </w:sectPr>
   </w:body>
 </w:document>
 </file>
 
-<file path=word/footer.xml><?xml version="1.0" encoding="utf-8"?>
-<w:ftr xmlns:w14="http://schemas.microsoft.com/office/word/2010/wordml" xmlns:w="http://schemas.openxmlformats.org/wordprocessingml/2006/main">
+<file path=word/endnotes.xml><?xml version="1.0" encoding="utf-8"?>
+<w:endnotes xmlns:wpc="http://schemas.microsoft.com/office/word/2010/wordprocessingCanvas" xmlns:cx="http://schemas.microsoft.com/office/drawing/2014/chartex" xmlns:cx1="http://schemas.microsoft.com/office/drawing/2015/9/8/chartex" xmlns:cx2="http://schemas.microsoft.com/office/drawing/2015/10/21/chartex" xmlns:cx3="http://schemas.microsoft.com/office/drawing/2016/5/9/chartex" xmlns:cx4="http://schemas.microsoft.com/office/drawing/2016/5/10/chartex" xmlns:cx5="http://schemas.microsoft.com/office/drawing/2016/5/11/chartex" xmlns:cx6="http://schemas.microsoft.com/office/drawing/2016/5/12/chartex" xmlns:cx7="http://schemas.microsoft.com/office/drawing/2016/5/13/chartex" xmlns:cx8="http://schemas.microsoft.com/office/drawing/2016/5/14/chartex" xmlns:mc="http://schemas.openxmlformats.org/markup-compatibility/2006" xmlns:aink="http://schemas.microsoft.com/office/drawing/2016/ink" xmlns:am3d="http://schemas.microsoft.com/office/drawing/2017/model3d" xmlns:o="urn:schemas-microsoft-com:office:office" xmlns:oel="http://schemas.microsoft.com/office/2019/extlst" xmlns:r="http://schemas.openxmlformats.org/officeDocument/2006/relationships" xmlns:m="http://schemas.openxmlformats.org/officeDocument/2006/math" xmlns:v="urn:schemas-microsoft-com:vml" xmlns:wp14="http://schemas.microsoft.com/office/word/2010/wordprocessingDrawing" xmlns:wp="http://schemas.openxmlformats.org/drawingml/2006/wordprocessingDrawing" xmlns:w10="urn:schemas-microsoft-com:office:word" xmlns:w="http://schemas.openxmlformats.org/wordprocessingml/2006/main" xmlns:w14="http://schemas.microsoft.com/office/word/2010/wordml" xmlns:w15="http://schemas.microsoft.com/office/word/2012/wordml" xmlns:w16cex="http://schemas.microsoft.com/office/word/2018/wordml/cex" xmlns:w16cid="http://schemas.microsoft.com/office/word/2016/wordml/cid" xmlns:w16="http://schemas.microsoft.com/office/word/2018/wordml" xmlns:w16du="http://schemas.microsoft.com/office/word/2023/wordml/word16du" xmlns:w16sdtdh="http://schemas.microsoft.com/office/word/2020/wordml/sdtdatahash" xmlns:w16sdtfl="http://schemas.microsoft.com/office/word/2024/wordml/sdtformatlock" xmlns:w16se="http://schemas.microsoft.com/office/word/2015/wordml/symex" xmlns:wpg="http://schemas.microsoft.com/office/word/2010/wordprocessingGroup" xmlns:wpi="http://schemas.microsoft.com/office/word/2010/wordprocessingInk" xmlns:wne="http://schemas.microsoft.com/office/word/2006/wordml" xmlns:wps="http://schemas.microsoft.com/office/word/2010/wordprocessingShape" mc:Ignorable="w14 w15 w16se w16cid w16 w16cex w16sdtdh w16sdtfl w16du wp14">
+  <w:endnote w:type="separator" w:id="-1">
+    <w:p>
+      <w:pPr>
+        <w:spacing w:after="0" w:line="240" w:lineRule="auto"/>
+      </w:pPr>
+      <w:r>
+        <w:separator/>
+      </w:r>
+    </w:p>
+  </w:endnote>
+  <w:endnote w:type="continuationSeparator" w:id="0">
+    <w:p>
+      <w:pPr>
+        <w:spacing w:after="0" w:line="240" w:lineRule="auto"/>
+      </w:pPr>
+      <w:r>
+        <w:continuationSeparator/>
+      </w:r>
+    </w:p>
+  </w:endnote>
+</w:endnotes>
+</file>
+
+<file path=word/footer1.xml><?xml version="1.0" encoding="utf-8"?>
+<w:ftr xmlns:wpc="http://schemas.microsoft.com/office/word/2010/wordprocessingCanvas" xmlns:cx="http://schemas.microsoft.com/office/drawing/2014/chartex" xmlns:cx1="http://schemas.microsoft.com/office/drawing/2015/9/8/chartex" xmlns:cx2="http://schemas.microsoft.com/office/drawing/2015/10/21/chartex" xmlns:cx3="http://schemas.microsoft.com/office/drawing/2016/5/9/chartex" xmlns:cx4="http://schemas.microsoft.com/office/drawing/2016/5/10/chartex" xmlns:cx5="http://schemas.microsoft.com/office/drawing/2016/5/11/chartex" xmlns:cx6="http://schemas.microsoft.com/office/drawing/2016/5/12/chartex" xmlns:cx7="http://schemas.microsoft.com/office/drawing/2016/5/13/chartex" xmlns:cx8="http://schemas.microsoft.com/office/drawing/2016/5/14/chartex" xmlns:mc="http://schemas.openxmlformats.org/markup-compatibility/2006" xmlns:aink="http://schemas.microsoft.com/office/drawing/2016/ink" xmlns:am3d="http://schemas.microsoft.com/office/drawing/2017/model3d" xmlns:o="urn:schemas-microsoft-com:office:office" xmlns:oel="http://schemas.microsoft.com/office/2019/extlst" xmlns:r="http://schemas.openxmlformats.org/officeDocument/2006/relationships" xmlns:m="http://schemas.openxmlformats.org/officeDocument/2006/math" xmlns:v="urn:schemas-microsoft-com:vml" xmlns:wp14="http://schemas.microsoft.com/office/word/2010/wordprocessingDrawing" xmlns:wp="http://schemas.openxmlformats.org/drawingml/2006/wordprocessingDrawing" xmlns:w10="urn:schemas-microsoft-com:office:word" xmlns:w="http://schemas.openxmlformats.org/wordprocessingml/2006/main" xmlns:w14="http://schemas.microsoft.com/office/word/2010/wordml" xmlns:w15="http://schemas.microsoft.com/office/word/2012/wordml" xmlns:w16cex="http://schemas.microsoft.com/office/word/2018/wordml/cex" xmlns:w16cid="http://schemas.microsoft.com/office/word/2016/wordml/cid" xmlns:w16="http://schemas.microsoft.com/office/word/2018/wordml" xmlns:w16du="http://schemas.microsoft.com/office/word/2023/wordml/word16du" xmlns:w16sdtdh="http://schemas.microsoft.com/office/word/2020/wordml/sdtdatahash" xmlns:w16sdtfl="http://schemas.microsoft.com/office/word/2024/wordml/sdtformatlock" xmlns:w16se="http://schemas.microsoft.com/office/word/2015/wordml/symex" xmlns:wpg="http://schemas.microsoft.com/office/word/2010/wordprocessingGroup" xmlns:wpi="http://schemas.microsoft.com/office/word/2010/wordprocessingInk" xmlns:wne="http://schemas.microsoft.com/office/word/2006/wordml" xmlns:wps="http://schemas.microsoft.com/office/word/2010/wordprocessingShape" mc:Ignorable="w14 w15 w16se w16cid w16 w16cex w16sdtdh w16sdtfl w16du wp14">
   <w:tbl>
     <w:tblPr>
-      <w:tblStyle w:val="TableNormal"/>
-      <w:bidiVisual w:val="0"/>
       <w:tblW w:w="0" w:type="auto"/>
       <w:tblLayout w:type="fixed"/>
       <w:tblLook w:val="06A0" w:firstRow="1" w:lastRow="0" w:firstColumn="1" w:lastColumn="0" w:noHBand="1" w:noVBand="1"/>
@@ -1068,26 +878,21 @@
       <w:tc>
         <w:tcPr>
           <w:tcW w:w="3005" w:type="dxa"/>
-          <w:tcMar/>
         </w:tcPr>
         <w:p>
           <w:pPr>
             <w:pStyle w:val="Header"/>
-            <w:bidi w:val="0"/>
             <w:ind w:left="-115"/>
-            <w:jc w:val="left"/>
           </w:pPr>
         </w:p>
       </w:tc>
       <w:tc>
         <w:tcPr>
           <w:tcW w:w="3005" w:type="dxa"/>
-          <w:tcMar/>
         </w:tcPr>
         <w:p>
           <w:pPr>
             <w:pStyle w:val="Header"/>
-            <w:bidi w:val="0"/>
             <w:jc w:val="center"/>
           </w:pPr>
         </w:p>
@@ -1095,12 +900,10 @@
       <w:tc>
         <w:tcPr>
           <w:tcW w:w="3005" w:type="dxa"/>
-          <w:tcMar/>
         </w:tcPr>
         <w:p>
           <w:pPr>
             <w:pStyle w:val="Header"/>
-            <w:bidi w:val="0"/>
             <w:ind w:right="-115"/>
             <w:jc w:val="right"/>
           </w:pPr>
@@ -1111,18 +914,40 @@
   <w:p>
     <w:pPr>
       <w:pStyle w:val="Footer"/>
-      <w:bidi w:val="0"/>
     </w:pPr>
   </w:p>
 </w:ftr>
 </file>
 
-<file path=word/header.xml><?xml version="1.0" encoding="utf-8"?>
-<w:hdr xmlns:w14="http://schemas.microsoft.com/office/word/2010/wordml" xmlns:w="http://schemas.openxmlformats.org/wordprocessingml/2006/main">
+<file path=word/footnotes.xml><?xml version="1.0" encoding="utf-8"?>
+<w:footnotes xmlns:wpc="http://schemas.microsoft.com/office/word/2010/wordprocessingCanvas" xmlns:cx="http://schemas.microsoft.com/office/drawing/2014/chartex" xmlns:cx1="http://schemas.microsoft.com/office/drawing/2015/9/8/chartex" xmlns:cx2="http://schemas.microsoft.com/office/drawing/2015/10/21/chartex" xmlns:cx3="http://schemas.microsoft.com/office/drawing/2016/5/9/chartex" xmlns:cx4="http://schemas.microsoft.com/office/drawing/2016/5/10/chartex" xmlns:cx5="http://schemas.microsoft.com/office/drawing/2016/5/11/chartex" xmlns:cx6="http://schemas.microsoft.com/office/drawing/2016/5/12/chartex" xmlns:cx7="http://schemas.microsoft.com/office/drawing/2016/5/13/chartex" xmlns:cx8="http://schemas.microsoft.com/office/drawing/2016/5/14/chartex" xmlns:mc="http://schemas.openxmlformats.org/markup-compatibility/2006" xmlns:aink="http://schemas.microsoft.com/office/drawing/2016/ink" xmlns:am3d="http://schemas.microsoft.com/office/drawing/2017/model3d" xmlns:o="urn:schemas-microsoft-com:office:office" xmlns:oel="http://schemas.microsoft.com/office/2019/extlst" xmlns:r="http://schemas.openxmlformats.org/officeDocument/2006/relationships" xmlns:m="http://schemas.openxmlformats.org/officeDocument/2006/math" xmlns:v="urn:schemas-microsoft-com:vml" xmlns:wp14="http://schemas.microsoft.com/office/word/2010/wordprocessingDrawing" xmlns:wp="http://schemas.openxmlformats.org/drawingml/2006/wordprocessingDrawing" xmlns:w10="urn:schemas-microsoft-com:office:word" xmlns:w="http://schemas.openxmlformats.org/wordprocessingml/2006/main" xmlns:w14="http://schemas.microsoft.com/office/word/2010/wordml" xmlns:w15="http://schemas.microsoft.com/office/word/2012/wordml" xmlns:w16cex="http://schemas.microsoft.com/office/word/2018/wordml/cex" xmlns:w16cid="http://schemas.microsoft.com/office/word/2016/wordml/cid" xmlns:w16="http://schemas.microsoft.com/office/word/2018/wordml" xmlns:w16du="http://schemas.microsoft.com/office/word/2023/wordml/word16du" xmlns:w16sdtdh="http://schemas.microsoft.com/office/word/2020/wordml/sdtdatahash" xmlns:w16sdtfl="http://schemas.microsoft.com/office/word/2024/wordml/sdtformatlock" xmlns:w16se="http://schemas.microsoft.com/office/word/2015/wordml/symex" xmlns:wpg="http://schemas.microsoft.com/office/word/2010/wordprocessingGroup" xmlns:wpi="http://schemas.microsoft.com/office/word/2010/wordprocessingInk" xmlns:wne="http://schemas.microsoft.com/office/word/2006/wordml" xmlns:wps="http://schemas.microsoft.com/office/word/2010/wordprocessingShape" mc:Ignorable="w14 w15 w16se w16cid w16 w16cex w16sdtdh w16sdtfl w16du wp14">
+  <w:footnote w:type="separator" w:id="-1">
+    <w:p>
+      <w:pPr>
+        <w:spacing w:after="0" w:line="240" w:lineRule="auto"/>
+      </w:pPr>
+      <w:r>
+        <w:separator/>
+      </w:r>
+    </w:p>
+  </w:footnote>
+  <w:footnote w:type="continuationSeparator" w:id="0">
+    <w:p>
+      <w:pPr>
+        <w:spacing w:after="0" w:line="240" w:lineRule="auto"/>
+      </w:pPr>
+      <w:r>
+        <w:continuationSeparator/>
+      </w:r>
+    </w:p>
+  </w:footnote>
+</w:footnotes>
+</file>
+
+<file path=word/header1.xml><?xml version="1.0" encoding="utf-8"?>
+<w:hdr xmlns:wpc="http://schemas.microsoft.com/office/word/2010/wordprocessingCanvas" xmlns:cx="http://schemas.microsoft.com/office/drawing/2014/chartex" xmlns:cx1="http://schemas.microsoft.com/office/drawing/2015/9/8/chartex" xmlns:cx2="http://schemas.microsoft.com/office/drawing/2015/10/21/chartex" xmlns:cx3="http://schemas.microsoft.com/office/drawing/2016/5/9/chartex" xmlns:cx4="http://schemas.microsoft.com/office/drawing/2016/5/10/chartex" xmlns:cx5="http://schemas.microsoft.com/office/drawing/2016/5/11/chartex" xmlns:cx6="http://schemas.microsoft.com/office/drawing/2016/5/12/chartex" xmlns:cx7="http://schemas.microsoft.com/office/drawing/2016/5/13/chartex" xmlns:cx8="http://schemas.microsoft.com/office/drawing/2016/5/14/chartex" xmlns:mc="http://schemas.openxmlformats.org/markup-compatibility/2006" xmlns:aink="http://schemas.microsoft.com/office/drawing/2016/ink" xmlns:am3d="http://schemas.microsoft.com/office/drawing/2017/model3d" xmlns:o="urn:schemas-microsoft-com:office:office" xmlns:oel="http://schemas.microsoft.com/office/2019/extlst" xmlns:r="http://schemas.openxmlformats.org/officeDocument/2006/relationships" xmlns:m="http://schemas.openxmlformats.org/officeDocument/2006/math" xmlns:v="urn:schemas-microsoft-com:vml" xmlns:wp14="http://schemas.microsoft.com/office/word/2010/wordprocessingDrawing" xmlns:wp="http://schemas.openxmlformats.org/drawingml/2006/wordprocessingDrawing" xmlns:w10="urn:schemas-microsoft-com:office:word" xmlns:w="http://schemas.openxmlformats.org/wordprocessingml/2006/main" xmlns:w14="http://schemas.microsoft.com/office/word/2010/wordml" xmlns:w15="http://schemas.microsoft.com/office/word/2012/wordml" xmlns:w16cex="http://schemas.microsoft.com/office/word/2018/wordml/cex" xmlns:w16cid="http://schemas.microsoft.com/office/word/2016/wordml/cid" xmlns:w16="http://schemas.microsoft.com/office/word/2018/wordml" xmlns:w16du="http://schemas.microsoft.com/office/word/2023/wordml/word16du" xmlns:w16sdtdh="http://schemas.microsoft.com/office/word/2020/wordml/sdtdatahash" xmlns:w16sdtfl="http://schemas.microsoft.com/office/word/2024/wordml/sdtformatlock" xmlns:w16se="http://schemas.microsoft.com/office/word/2015/wordml/symex" xmlns:wpg="http://schemas.microsoft.com/office/word/2010/wordprocessingGroup" xmlns:wpi="http://schemas.microsoft.com/office/word/2010/wordprocessingInk" xmlns:wne="http://schemas.microsoft.com/office/word/2006/wordml" xmlns:wps="http://schemas.microsoft.com/office/word/2010/wordprocessingShape" mc:Ignorable="w14 w15 w16se w16cid w16 w16cex w16sdtdh w16sdtfl w16du wp14">
   <w:tbl>
     <w:tblPr>
-      <w:tblStyle w:val="TableNormal"/>
-      <w:bidiVisual w:val="0"/>
       <w:tblW w:w="0" w:type="auto"/>
       <w:tblLayout w:type="fixed"/>
       <w:tblLook w:val="06A0" w:firstRow="1" w:lastRow="0" w:firstColumn="1" w:lastColumn="0" w:noHBand="1" w:noVBand="1"/>
@@ -1139,26 +964,21 @@
       <w:tc>
         <w:tcPr>
           <w:tcW w:w="3005" w:type="dxa"/>
-          <w:tcMar/>
         </w:tcPr>
         <w:p>
           <w:pPr>
             <w:pStyle w:val="Header"/>
-            <w:bidi w:val="0"/>
             <w:ind w:left="-115"/>
-            <w:jc w:val="left"/>
           </w:pPr>
         </w:p>
       </w:tc>
       <w:tc>
         <w:tcPr>
           <w:tcW w:w="3005" w:type="dxa"/>
-          <w:tcMar/>
         </w:tcPr>
         <w:p>
           <w:pPr>
             <w:pStyle w:val="Header"/>
-            <w:bidi w:val="0"/>
             <w:jc w:val="center"/>
           </w:pPr>
         </w:p>
@@ -1166,12 +986,10 @@
       <w:tc>
         <w:tcPr>
           <w:tcW w:w="3005" w:type="dxa"/>
-          <w:tcMar/>
         </w:tcPr>
         <w:p>
           <w:pPr>
             <w:pStyle w:val="Header"/>
-            <w:bidi w:val="0"/>
             <w:ind w:right="-115"/>
             <w:jc w:val="right"/>
           </w:pPr>
@@ -1182,7 +1000,6 @@
   <w:p>
     <w:pPr>
       <w:pStyle w:val="Header"/>
-      <w:bidi w:val="0"/>
     </w:pPr>
   </w:p>
 </w:hdr>
@@ -1190,118 +1007,6 @@
 
 <file path=word/numbering.xml><?xml version="1.0" encoding="utf-8"?>
 <w:numbering xmlns:wpc="http://schemas.microsoft.com/office/word/2010/wordprocessingCanvas" xmlns:cx="http://schemas.microsoft.com/office/drawing/2014/chartex" xmlns:cx1="http://schemas.microsoft.com/office/drawing/2015/9/8/chartex" xmlns:cx2="http://schemas.microsoft.com/office/drawing/2015/10/21/chartex" xmlns:cx3="http://schemas.microsoft.com/office/drawing/2016/5/9/chartex" xmlns:cx4="http://schemas.microsoft.com/office/drawing/2016/5/10/chartex" xmlns:cx5="http://schemas.microsoft.com/office/drawing/2016/5/11/chartex" xmlns:cx6="http://schemas.microsoft.com/office/drawing/2016/5/12/chartex" xmlns:cx7="http://schemas.microsoft.com/office/drawing/2016/5/13/chartex" xmlns:cx8="http://schemas.microsoft.com/office/drawing/2016/5/14/chartex" xmlns:mc="http://schemas.openxmlformats.org/markup-compatibility/2006" xmlns:aink="http://schemas.microsoft.com/office/drawing/2016/ink" xmlns:am3d="http://schemas.microsoft.com/office/drawing/2017/model3d" xmlns:o="urn:schemas-microsoft-com:office:office" xmlns:oel="http://schemas.microsoft.com/office/2019/extlst" xmlns:r="http://schemas.openxmlformats.org/officeDocument/2006/relationships" xmlns:m="http://schemas.openxmlformats.org/officeDocument/2006/math" xmlns:v="urn:schemas-microsoft-com:vml" xmlns:wp14="http://schemas.microsoft.com/office/word/2010/wordprocessingDrawing" xmlns:wp="http://schemas.openxmlformats.org/drawingml/2006/wordprocessingDrawing" xmlns:w10="urn:schemas-microsoft-com:office:word" xmlns:w="http://schemas.openxmlformats.org/wordprocessingml/2006/main" xmlns:w14="http://schemas.microsoft.com/office/word/2010/wordml" xmlns:w15="http://schemas.microsoft.com/office/word/2012/wordml" xmlns:w16cex="http://schemas.microsoft.com/office/word/2018/wordml/cex" xmlns:w16cid="http://schemas.microsoft.com/office/word/2016/wordml/cid" xmlns:w16="http://schemas.microsoft.com/office/word/2018/wordml" xmlns:w16du="http://schemas.microsoft.com/office/word/2023/wordml/word16du" xmlns:w16sdtdh="http://schemas.microsoft.com/office/word/2020/wordml/sdtdatahash" xmlns:w16sdtfl="http://schemas.microsoft.com/office/word/2024/wordml/sdtformatlock" xmlns:w16se="http://schemas.microsoft.com/office/word/2015/wordml/symex" xmlns:wpg="http://schemas.microsoft.com/office/word/2010/wordprocessingGroup" xmlns:wpi="http://schemas.microsoft.com/office/word/2010/wordprocessingInk" xmlns:wne="http://schemas.microsoft.com/office/word/2006/wordml" xmlns:wps="http://schemas.microsoft.com/office/word/2010/wordprocessingShape" mc:Ignorable="w14 w15 w16se w16cid w16 w16cex w16sdtdh w16sdtfl w16du wp14">
-  <w:abstractNum xmlns:w="http://schemas.openxmlformats.org/wordprocessingml/2006/main" w:abstractNumId="2">
-    <w:nsid w:val="40f20d24"/>
-    <w:multiLevelType xmlns:w="http://schemas.openxmlformats.org/wordprocessingml/2006/main" w:val="hybridMultilevel"/>
-    <w:lvl xmlns:w="http://schemas.openxmlformats.org/wordprocessingml/2006/main" w:ilvl="0">
-      <w:start w:val="1"/>
-      <w:numFmt w:val="bullet"/>
-      <w:lvlText w:val=""/>
-      <w:lvlJc w:val="left"/>
-      <w:pPr>
-        <w:ind w:left="720" w:hanging="360"/>
-      </w:pPr>
-      <w:rPr>
-        <w:rFonts w:hint="default" w:ascii="Symbol" w:hAnsi="Symbol"/>
-      </w:rPr>
-    </w:lvl>
-    <w:lvl xmlns:w="http://schemas.openxmlformats.org/wordprocessingml/2006/main" w:ilvl="1">
-      <w:start w:val="1"/>
-      <w:numFmt w:val="bullet"/>
-      <w:lvlText w:val="o"/>
-      <w:lvlJc w:val="left"/>
-      <w:pPr>
-        <w:ind w:left="1440" w:hanging="360"/>
-      </w:pPr>
-      <w:rPr>
-        <w:rFonts w:hint="default" w:ascii="Courier New" w:hAnsi="Courier New"/>
-      </w:rPr>
-    </w:lvl>
-    <w:lvl xmlns:w="http://schemas.openxmlformats.org/wordprocessingml/2006/main" w:ilvl="2">
-      <w:start w:val="1"/>
-      <w:numFmt w:val="bullet"/>
-      <w:lvlText w:val=""/>
-      <w:lvlJc w:val="left"/>
-      <w:pPr>
-        <w:ind w:left="2160" w:hanging="360"/>
-      </w:pPr>
-      <w:rPr>
-        <w:rFonts w:hint="default" w:ascii="Wingdings" w:hAnsi="Wingdings"/>
-      </w:rPr>
-    </w:lvl>
-    <w:lvl xmlns:w="http://schemas.openxmlformats.org/wordprocessingml/2006/main" w:ilvl="3">
-      <w:start w:val="1"/>
-      <w:numFmt w:val="bullet"/>
-      <w:lvlText w:val=""/>
-      <w:lvlJc w:val="left"/>
-      <w:pPr>
-        <w:ind w:left="2880" w:hanging="360"/>
-      </w:pPr>
-      <w:rPr>
-        <w:rFonts w:hint="default" w:ascii="Symbol" w:hAnsi="Symbol"/>
-      </w:rPr>
-    </w:lvl>
-    <w:lvl xmlns:w="http://schemas.openxmlformats.org/wordprocessingml/2006/main" w:ilvl="4">
-      <w:start w:val="1"/>
-      <w:numFmt w:val="bullet"/>
-      <w:lvlText w:val="o"/>
-      <w:lvlJc w:val="left"/>
-      <w:pPr>
-        <w:ind w:left="3600" w:hanging="360"/>
-      </w:pPr>
-      <w:rPr>
-        <w:rFonts w:hint="default" w:ascii="Courier New" w:hAnsi="Courier New"/>
-      </w:rPr>
-    </w:lvl>
-    <w:lvl xmlns:w="http://schemas.openxmlformats.org/wordprocessingml/2006/main" w:ilvl="5">
-      <w:start w:val="1"/>
-      <w:numFmt w:val="bullet"/>
-      <w:lvlText w:val=""/>
-      <w:lvlJc w:val="left"/>
-      <w:pPr>
-        <w:ind w:left="4320" w:hanging="360"/>
-      </w:pPr>
-      <w:rPr>
-        <w:rFonts w:hint="default" w:ascii="Wingdings" w:hAnsi="Wingdings"/>
-      </w:rPr>
-    </w:lvl>
-    <w:lvl xmlns:w="http://schemas.openxmlformats.org/wordprocessingml/2006/main" w:ilvl="6">
-      <w:start w:val="1"/>
-      <w:numFmt w:val="bullet"/>
-      <w:lvlText w:val=""/>
-      <w:lvlJc w:val="left"/>
-      <w:pPr>
-        <w:ind w:left="5040" w:hanging="360"/>
-      </w:pPr>
-      <w:rPr>
-        <w:rFonts w:hint="default" w:ascii="Symbol" w:hAnsi="Symbol"/>
-      </w:rPr>
-    </w:lvl>
-    <w:lvl xmlns:w="http://schemas.openxmlformats.org/wordprocessingml/2006/main" w:ilvl="7">
-      <w:start w:val="1"/>
-      <w:numFmt w:val="bullet"/>
-      <w:lvlText w:val="o"/>
-      <w:lvlJc w:val="left"/>
-      <w:pPr>
-        <w:ind w:left="5760" w:hanging="360"/>
-      </w:pPr>
-      <w:rPr>
-        <w:rFonts w:hint="default" w:ascii="Courier New" w:hAnsi="Courier New"/>
-      </w:rPr>
-    </w:lvl>
-    <w:lvl xmlns:w="http://schemas.openxmlformats.org/wordprocessingml/2006/main" w:ilvl="8">
-      <w:start w:val="1"/>
-      <w:numFmt w:val="bullet"/>
-      <w:lvlText w:val=""/>
-      <w:lvlJc w:val="left"/>
-      <w:pPr>
-        <w:ind w:left="6480" w:hanging="360"/>
-      </w:pPr>
-      <w:rPr>
-        <w:rFonts w:hint="default" w:ascii="Wingdings" w:hAnsi="Wingdings"/>
-      </w:rPr>
-    </w:lvl>
-  </w:abstractNum>
   <w:abstractNum w:abstractNumId="0" w15:restartNumberingAfterBreak="0">
     <w:nsid w:val="2CB7198D"/>
     <w:multiLevelType w:val="hybridMultilevel"/>
@@ -1315,7 +1020,7 @@
         <w:ind w:left="720" w:hanging="360"/>
       </w:pPr>
       <w:rPr>
-        <w:rFonts w:hint="default" w:ascii="Symbol" w:hAnsi="Symbol"/>
+        <w:rFonts w:ascii="Symbol" w:hAnsi="Symbol" w:hint="default"/>
       </w:rPr>
     </w:lvl>
     <w:lvl w:ilvl="1" w:tplc="08090003" w:tentative="1">
@@ -1327,7 +1032,7 @@
         <w:ind w:left="1440" w:hanging="360"/>
       </w:pPr>
       <w:rPr>
-        <w:rFonts w:hint="default" w:ascii="Courier New" w:hAnsi="Courier New" w:cs="Courier New"/>
+        <w:rFonts w:ascii="Courier New" w:hAnsi="Courier New" w:cs="Courier New" w:hint="default"/>
       </w:rPr>
     </w:lvl>
     <w:lvl w:ilvl="2" w:tplc="08090005" w:tentative="1">
@@ -1339,7 +1044,7 @@
         <w:ind w:left="2160" w:hanging="360"/>
       </w:pPr>
       <w:rPr>
-        <w:rFonts w:hint="default" w:ascii="Wingdings" w:hAnsi="Wingdings"/>
+        <w:rFonts w:ascii="Wingdings" w:hAnsi="Wingdings" w:hint="default"/>
       </w:rPr>
     </w:lvl>
     <w:lvl w:ilvl="3" w:tplc="08090001" w:tentative="1">
@@ -1351,7 +1056,7 @@
         <w:ind w:left="2880" w:hanging="360"/>
       </w:pPr>
       <w:rPr>
-        <w:rFonts w:hint="default" w:ascii="Symbol" w:hAnsi="Symbol"/>
+        <w:rFonts w:ascii="Symbol" w:hAnsi="Symbol" w:hint="default"/>
       </w:rPr>
     </w:lvl>
     <w:lvl w:ilvl="4" w:tplc="08090003" w:tentative="1">
@@ -1363,7 +1068,7 @@
         <w:ind w:left="3600" w:hanging="360"/>
       </w:pPr>
       <w:rPr>
-        <w:rFonts w:hint="default" w:ascii="Courier New" w:hAnsi="Courier New" w:cs="Courier New"/>
+        <w:rFonts w:ascii="Courier New" w:hAnsi="Courier New" w:cs="Courier New" w:hint="default"/>
       </w:rPr>
     </w:lvl>
     <w:lvl w:ilvl="5" w:tplc="08090005" w:tentative="1">
@@ -1375,7 +1080,7 @@
         <w:ind w:left="4320" w:hanging="360"/>
       </w:pPr>
       <w:rPr>
-        <w:rFonts w:hint="default" w:ascii="Wingdings" w:hAnsi="Wingdings"/>
+        <w:rFonts w:ascii="Wingdings" w:hAnsi="Wingdings" w:hint="default"/>
       </w:rPr>
     </w:lvl>
     <w:lvl w:ilvl="6" w:tplc="08090001" w:tentative="1">
@@ -1387,7 +1092,7 @@
         <w:ind w:left="5040" w:hanging="360"/>
       </w:pPr>
       <w:rPr>
-        <w:rFonts w:hint="default" w:ascii="Symbol" w:hAnsi="Symbol"/>
+        <w:rFonts w:ascii="Symbol" w:hAnsi="Symbol" w:hint="default"/>
       </w:rPr>
     </w:lvl>
     <w:lvl w:ilvl="7" w:tplc="08090003" w:tentative="1">
@@ -1399,7 +1104,7 @@
         <w:ind w:left="5760" w:hanging="360"/>
       </w:pPr>
       <w:rPr>
-        <w:rFonts w:hint="default" w:ascii="Courier New" w:hAnsi="Courier New" w:cs="Courier New"/>
+        <w:rFonts w:ascii="Courier New" w:hAnsi="Courier New" w:cs="Courier New" w:hint="default"/>
       </w:rPr>
     </w:lvl>
     <w:lvl w:ilvl="8" w:tplc="08090005" w:tentative="1">
@@ -1411,11 +1116,124 @@
         <w:ind w:left="6480" w:hanging="360"/>
       </w:pPr>
       <w:rPr>
-        <w:rFonts w:hint="default" w:ascii="Wingdings" w:hAnsi="Wingdings"/>
+        <w:rFonts w:ascii="Wingdings" w:hAnsi="Wingdings" w:hint="default"/>
       </w:rPr>
     </w:lvl>
   </w:abstractNum>
   <w:abstractNum w:abstractNumId="1" w15:restartNumberingAfterBreak="0">
+    <w:nsid w:val="40F20D24"/>
+    <w:multiLevelType w:val="hybridMultilevel"/>
+    <w:tmpl w:val="1F6E1870"/>
+    <w:lvl w:ilvl="0" w:tplc="E4FAFEE2">
+      <w:start w:val="1"/>
+      <w:numFmt w:val="bullet"/>
+      <w:lvlText w:val=""/>
+      <w:lvlJc w:val="left"/>
+      <w:pPr>
+        <w:ind w:left="720" w:hanging="360"/>
+      </w:pPr>
+      <w:rPr>
+        <w:rFonts w:ascii="Symbol" w:hAnsi="Symbol" w:hint="default"/>
+      </w:rPr>
+    </w:lvl>
+    <w:lvl w:ilvl="1" w:tplc="B5DEAB48">
+      <w:start w:val="1"/>
+      <w:numFmt w:val="bullet"/>
+      <w:lvlText w:val="o"/>
+      <w:lvlJc w:val="left"/>
+      <w:pPr>
+        <w:ind w:left="1440" w:hanging="360"/>
+      </w:pPr>
+      <w:rPr>
+        <w:rFonts w:ascii="Courier New" w:hAnsi="Courier New" w:hint="default"/>
+      </w:rPr>
+    </w:lvl>
+    <w:lvl w:ilvl="2" w:tplc="6C0EDDBC">
+      <w:start w:val="1"/>
+      <w:numFmt w:val="bullet"/>
+      <w:lvlText w:val=""/>
+      <w:lvlJc w:val="left"/>
+      <w:pPr>
+        <w:ind w:left="2160" w:hanging="360"/>
+      </w:pPr>
+      <w:rPr>
+        <w:rFonts w:ascii="Wingdings" w:hAnsi="Wingdings" w:hint="default"/>
+      </w:rPr>
+    </w:lvl>
+    <w:lvl w:ilvl="3" w:tplc="12BAD336">
+      <w:start w:val="1"/>
+      <w:numFmt w:val="bullet"/>
+      <w:lvlText w:val=""/>
+      <w:lvlJc w:val="left"/>
+      <w:pPr>
+        <w:ind w:left="2880" w:hanging="360"/>
+      </w:pPr>
+      <w:rPr>
+        <w:rFonts w:ascii="Symbol" w:hAnsi="Symbol" w:hint="default"/>
+      </w:rPr>
+    </w:lvl>
+    <w:lvl w:ilvl="4" w:tplc="598CCF1C">
+      <w:start w:val="1"/>
+      <w:numFmt w:val="bullet"/>
+      <w:lvlText w:val="o"/>
+      <w:lvlJc w:val="left"/>
+      <w:pPr>
+        <w:ind w:left="3600" w:hanging="360"/>
+      </w:pPr>
+      <w:rPr>
+        <w:rFonts w:ascii="Courier New" w:hAnsi="Courier New" w:hint="default"/>
+      </w:rPr>
+    </w:lvl>
+    <w:lvl w:ilvl="5" w:tplc="E0106144">
+      <w:start w:val="1"/>
+      <w:numFmt w:val="bullet"/>
+      <w:lvlText w:val=""/>
+      <w:lvlJc w:val="left"/>
+      <w:pPr>
+        <w:ind w:left="4320" w:hanging="360"/>
+      </w:pPr>
+      <w:rPr>
+        <w:rFonts w:ascii="Wingdings" w:hAnsi="Wingdings" w:hint="default"/>
+      </w:rPr>
+    </w:lvl>
+    <w:lvl w:ilvl="6" w:tplc="0900A16A">
+      <w:start w:val="1"/>
+      <w:numFmt w:val="bullet"/>
+      <w:lvlText w:val=""/>
+      <w:lvlJc w:val="left"/>
+      <w:pPr>
+        <w:ind w:left="5040" w:hanging="360"/>
+      </w:pPr>
+      <w:rPr>
+        <w:rFonts w:ascii="Symbol" w:hAnsi="Symbol" w:hint="default"/>
+      </w:rPr>
+    </w:lvl>
+    <w:lvl w:ilvl="7" w:tplc="DD3A9768">
+      <w:start w:val="1"/>
+      <w:numFmt w:val="bullet"/>
+      <w:lvlText w:val="o"/>
+      <w:lvlJc w:val="left"/>
+      <w:pPr>
+        <w:ind w:left="5760" w:hanging="360"/>
+      </w:pPr>
+      <w:rPr>
+        <w:rFonts w:ascii="Courier New" w:hAnsi="Courier New" w:hint="default"/>
+      </w:rPr>
+    </w:lvl>
+    <w:lvl w:ilvl="8" w:tplc="E76EFBB2">
+      <w:start w:val="1"/>
+      <w:numFmt w:val="bullet"/>
+      <w:lvlText w:val=""/>
+      <w:lvlJc w:val="left"/>
+      <w:pPr>
+        <w:ind w:left="6480" w:hanging="360"/>
+      </w:pPr>
+      <w:rPr>
+        <w:rFonts w:ascii="Wingdings" w:hAnsi="Wingdings" w:hint="default"/>
+      </w:rPr>
+    </w:lvl>
+  </w:abstractNum>
+  <w:abstractNum w:abstractNumId="2" w15:restartNumberingAfterBreak="0">
     <w:nsid w:val="475729AD"/>
     <w:multiLevelType w:val="multilevel"/>
     <w:tmpl w:val="23666F96"/>
@@ -1431,7 +1249,7 @@
         <w:ind w:left="720" w:hanging="360"/>
       </w:pPr>
       <w:rPr>
-        <w:rFonts w:hint="default" w:ascii="Symbol" w:hAnsi="Symbol"/>
+        <w:rFonts w:ascii="Symbol" w:hAnsi="Symbol" w:hint="default"/>
         <w:sz w:val="20"/>
       </w:rPr>
     </w:lvl>
@@ -1447,7 +1265,7 @@
         <w:ind w:left="1440" w:hanging="360"/>
       </w:pPr>
       <w:rPr>
-        <w:rFonts w:hint="default" w:ascii="Courier New" w:hAnsi="Courier New"/>
+        <w:rFonts w:ascii="Courier New" w:hAnsi="Courier New" w:hint="default"/>
         <w:sz w:val="20"/>
       </w:rPr>
     </w:lvl>
@@ -1463,7 +1281,7 @@
         <w:ind w:left="2160" w:hanging="360"/>
       </w:pPr>
       <w:rPr>
-        <w:rFonts w:hint="default" w:ascii="Wingdings" w:hAnsi="Wingdings"/>
+        <w:rFonts w:ascii="Wingdings" w:hAnsi="Wingdings" w:hint="default"/>
         <w:sz w:val="20"/>
       </w:rPr>
     </w:lvl>
@@ -1479,7 +1297,7 @@
         <w:ind w:left="2880" w:hanging="360"/>
       </w:pPr>
       <w:rPr>
-        <w:rFonts w:hint="default" w:ascii="Wingdings" w:hAnsi="Wingdings"/>
+        <w:rFonts w:ascii="Wingdings" w:hAnsi="Wingdings" w:hint="default"/>
         <w:sz w:val="20"/>
       </w:rPr>
     </w:lvl>
@@ -1495,7 +1313,7 @@
         <w:ind w:left="3600" w:hanging="360"/>
       </w:pPr>
       <w:rPr>
-        <w:rFonts w:hint="default" w:ascii="Wingdings" w:hAnsi="Wingdings"/>
+        <w:rFonts w:ascii="Wingdings" w:hAnsi="Wingdings" w:hint="default"/>
         <w:sz w:val="20"/>
       </w:rPr>
     </w:lvl>
@@ -1511,7 +1329,7 @@
         <w:ind w:left="4320" w:hanging="360"/>
       </w:pPr>
       <w:rPr>
-        <w:rFonts w:hint="default" w:ascii="Wingdings" w:hAnsi="Wingdings"/>
+        <w:rFonts w:ascii="Wingdings" w:hAnsi="Wingdings" w:hint="default"/>
         <w:sz w:val="20"/>
       </w:rPr>
     </w:lvl>
@@ -1527,7 +1345,7 @@
         <w:ind w:left="5040" w:hanging="360"/>
       </w:pPr>
       <w:rPr>
-        <w:rFonts w:hint="default" w:ascii="Wingdings" w:hAnsi="Wingdings"/>
+        <w:rFonts w:ascii="Wingdings" w:hAnsi="Wingdings" w:hint="default"/>
         <w:sz w:val="20"/>
       </w:rPr>
     </w:lvl>
@@ -1543,7 +1361,7 @@
         <w:ind w:left="5760" w:hanging="360"/>
       </w:pPr>
       <w:rPr>
-        <w:rFonts w:hint="default" w:ascii="Wingdings" w:hAnsi="Wingdings"/>
+        <w:rFonts w:ascii="Wingdings" w:hAnsi="Wingdings" w:hint="default"/>
         <w:sz w:val="20"/>
       </w:rPr>
     </w:lvl>
@@ -1559,19 +1377,19 @@
         <w:ind w:left="6480" w:hanging="360"/>
       </w:pPr>
       <w:rPr>
-        <w:rFonts w:hint="default" w:ascii="Wingdings" w:hAnsi="Wingdings"/>
+        <w:rFonts w:ascii="Wingdings" w:hAnsi="Wingdings" w:hint="default"/>
         <w:sz w:val="20"/>
       </w:rPr>
     </w:lvl>
   </w:abstractNum>
-  <w:num w:numId="3">
-    <w:abstractNumId w:val="2"/>
+  <w:num w:numId="1" w16cid:durableId="703095923">
+    <w:abstractNumId w:val="1"/>
   </w:num>
-  <w:num w:numId="1" w16cid:durableId="1760910559">
+  <w:num w:numId="2" w16cid:durableId="1760910559">
     <w:abstractNumId w:val="0"/>
   </w:num>
-  <w:num w:numId="2" w16cid:durableId="895050343">
-    <w:abstractNumId w:val="1"/>
+  <w:num w:numId="3" w16cid:durableId="895050343">
+    <w:abstractNumId w:val="2"/>
   </w:num>
 </w:numbering>
 </file>
@@ -1581,7 +1399,7 @@
   <w:docDefaults>
     <w:rPrDefault>
       <w:rPr>
-        <w:rFonts w:asciiTheme="minorHAnsi" w:hAnsiTheme="minorHAnsi" w:eastAsiaTheme="minorHAnsi" w:cstheme="minorBidi"/>
+        <w:rFonts w:asciiTheme="minorHAnsi" w:eastAsiaTheme="minorHAnsi" w:hAnsiTheme="minorHAnsi" w:cstheme="minorBidi"/>
         <w:sz w:val="22"/>
         <w:szCs w:val="22"/>
         <w:lang w:val="en-GB" w:eastAsia="en-US" w:bidi="ar-SA"/>
@@ -1596,14 +1414,14 @@
   <w:latentStyles w:defLockedState="0" w:defUIPriority="99" w:defSemiHidden="0" w:defUnhideWhenUsed="0" w:defQFormat="0" w:count="376">
     <w:lsdException w:name="Normal" w:uiPriority="0" w:qFormat="1"/>
     <w:lsdException w:name="heading 1" w:uiPriority="9" w:qFormat="1"/>
-    <w:lsdException w:name="heading 2" w:uiPriority="9" w:semiHidden="1" w:unhideWhenUsed="1" w:qFormat="1"/>
-    <w:lsdException w:name="heading 3" w:uiPriority="9" w:semiHidden="1" w:unhideWhenUsed="1" w:qFormat="1"/>
-    <w:lsdException w:name="heading 4" w:uiPriority="9" w:semiHidden="1" w:unhideWhenUsed="1" w:qFormat="1"/>
-    <w:lsdException w:name="heading 5" w:uiPriority="9" w:semiHidden="1" w:unhideWhenUsed="1" w:qFormat="1"/>
-    <w:lsdException w:name="heading 6" w:uiPriority="9" w:semiHidden="1" w:unhideWhenUsed="1" w:qFormat="1"/>
-    <w:lsdException w:name="heading 7" w:uiPriority="9" w:semiHidden="1" w:unhideWhenUsed="1" w:qFormat="1"/>
-    <w:lsdException w:name="heading 8" w:uiPriority="9" w:semiHidden="1" w:unhideWhenUsed="1" w:qFormat="1"/>
-    <w:lsdException w:name="heading 9" w:uiPriority="9" w:semiHidden="1" w:unhideWhenUsed="1" w:qFormat="1"/>
+    <w:lsdException w:name="heading 2" w:semiHidden="1" w:uiPriority="9" w:unhideWhenUsed="1" w:qFormat="1"/>
+    <w:lsdException w:name="heading 3" w:semiHidden="1" w:uiPriority="9" w:unhideWhenUsed="1" w:qFormat="1"/>
+    <w:lsdException w:name="heading 4" w:semiHidden="1" w:uiPriority="9" w:unhideWhenUsed="1" w:qFormat="1"/>
+    <w:lsdException w:name="heading 5" w:semiHidden="1" w:uiPriority="9" w:unhideWhenUsed="1" w:qFormat="1"/>
+    <w:lsdException w:name="heading 6" w:semiHidden="1" w:uiPriority="9" w:unhideWhenUsed="1" w:qFormat="1"/>
+    <w:lsdException w:name="heading 7" w:semiHidden="1" w:uiPriority="9" w:unhideWhenUsed="1" w:qFormat="1"/>
+    <w:lsdException w:name="heading 8" w:semiHidden="1" w:uiPriority="9" w:unhideWhenUsed="1" w:qFormat="1"/>
+    <w:lsdException w:name="heading 9" w:semiHidden="1" w:uiPriority="9" w:unhideWhenUsed="1" w:qFormat="1"/>
     <w:lsdException w:name="index 1" w:semiHidden="1" w:unhideWhenUsed="1"/>
     <w:lsdException w:name="index 2" w:semiHidden="1" w:unhideWhenUsed="1"/>
     <w:lsdException w:name="index 3" w:semiHidden="1" w:unhideWhenUsed="1"/>
@@ -1613,22 +1431,22 @@
     <w:lsdException w:name="index 7" w:semiHidden="1" w:unhideWhenUsed="1"/>
     <w:lsdException w:name="index 8" w:semiHidden="1" w:unhideWhenUsed="1"/>
     <w:lsdException w:name="index 9" w:semiHidden="1" w:unhideWhenUsed="1"/>
-    <w:lsdException w:name="toc 1" w:uiPriority="39" w:semiHidden="1" w:unhideWhenUsed="1"/>
-    <w:lsdException w:name="toc 2" w:uiPriority="39" w:semiHidden="1" w:unhideWhenUsed="1"/>
-    <w:lsdException w:name="toc 3" w:uiPriority="39" w:semiHidden="1" w:unhideWhenUsed="1"/>
-    <w:lsdException w:name="toc 4" w:uiPriority="39" w:semiHidden="1" w:unhideWhenUsed="1"/>
-    <w:lsdException w:name="toc 5" w:uiPriority="39" w:semiHidden="1" w:unhideWhenUsed="1"/>
-    <w:lsdException w:name="toc 6" w:uiPriority="39" w:semiHidden="1" w:unhideWhenUsed="1"/>
-    <w:lsdException w:name="toc 7" w:uiPriority="39" w:semiHidden="1" w:unhideWhenUsed="1"/>
-    <w:lsdException w:name="toc 8" w:uiPriority="39" w:semiHidden="1" w:unhideWhenUsed="1"/>
-    <w:lsdException w:name="toc 9" w:uiPriority="39" w:semiHidden="1" w:unhideWhenUsed="1"/>
+    <w:lsdException w:name="toc 1" w:semiHidden="1" w:uiPriority="39" w:unhideWhenUsed="1"/>
+    <w:lsdException w:name="toc 2" w:semiHidden="1" w:uiPriority="39" w:unhideWhenUsed="1"/>
+    <w:lsdException w:name="toc 3" w:semiHidden="1" w:uiPriority="39" w:unhideWhenUsed="1"/>
+    <w:lsdException w:name="toc 4" w:semiHidden="1" w:uiPriority="39" w:unhideWhenUsed="1"/>
+    <w:lsdException w:name="toc 5" w:semiHidden="1" w:uiPriority="39" w:unhideWhenUsed="1"/>
+    <w:lsdException w:name="toc 6" w:semiHidden="1" w:uiPriority="39" w:unhideWhenUsed="1"/>
+    <w:lsdException w:name="toc 7" w:semiHidden="1" w:uiPriority="39" w:unhideWhenUsed="1"/>
+    <w:lsdException w:name="toc 8" w:semiHidden="1" w:uiPriority="39" w:unhideWhenUsed="1"/>
+    <w:lsdException w:name="toc 9" w:semiHidden="1" w:uiPriority="39" w:unhideWhenUsed="1"/>
     <w:lsdException w:name="Normal Indent" w:semiHidden="1" w:unhideWhenUsed="1"/>
     <w:lsdException w:name="footnote text" w:semiHidden="1" w:unhideWhenUsed="1"/>
     <w:lsdException w:name="annotation text" w:semiHidden="1" w:unhideWhenUsed="1"/>
     <w:lsdException w:name="header" w:semiHidden="1" w:unhideWhenUsed="1"/>
     <w:lsdException w:name="footer" w:semiHidden="1" w:unhideWhenUsed="1"/>
     <w:lsdException w:name="index heading" w:semiHidden="1" w:unhideWhenUsed="1"/>
-    <w:lsdException w:name="caption" w:uiPriority="35" w:semiHidden="1" w:unhideWhenUsed="1" w:qFormat="1"/>
+    <w:lsdException w:name="caption" w:semiHidden="1" w:uiPriority="35" w:unhideWhenUsed="1" w:qFormat="1"/>
     <w:lsdException w:name="table of figures" w:semiHidden="1" w:unhideWhenUsed="1"/>
     <w:lsdException w:name="envelope address" w:semiHidden="1" w:unhideWhenUsed="1"/>
     <w:lsdException w:name="envelope return" w:semiHidden="1" w:unhideWhenUsed="1"/>
@@ -1659,7 +1477,7 @@
     <w:lsdException w:name="Title" w:uiPriority="10" w:qFormat="1"/>
     <w:lsdException w:name="Closing" w:semiHidden="1" w:unhideWhenUsed="1"/>
     <w:lsdException w:name="Signature" w:semiHidden="1" w:unhideWhenUsed="1"/>
-    <w:lsdException w:name="Default Paragraph Font" w:uiPriority="1" w:semiHidden="1" w:unhideWhenUsed="1"/>
+    <w:lsdException w:name="Default Paragraph Font" w:semiHidden="1" w:uiPriority="1" w:unhideWhenUsed="1"/>
     <w:lsdException w:name="Body Text" w:semiHidden="1" w:unhideWhenUsed="1"/>
     <w:lsdException w:name="Body Text Indent" w:semiHidden="1" w:unhideWhenUsed="1"/>
     <w:lsdException w:name="List Continue" w:semiHidden="1" w:unhideWhenUsed="1"/>
@@ -1859,8 +1677,8 @@
     <w:lsdException w:name="Subtle Reference" w:uiPriority="31" w:qFormat="1"/>
     <w:lsdException w:name="Intense Reference" w:uiPriority="32" w:qFormat="1"/>
     <w:lsdException w:name="Book Title" w:uiPriority="33" w:qFormat="1"/>
-    <w:lsdException w:name="Bibliography" w:uiPriority="37" w:semiHidden="1" w:unhideWhenUsed="1"/>
-    <w:lsdException w:name="TOC Heading" w:uiPriority="39" w:semiHidden="1" w:unhideWhenUsed="1" w:qFormat="1"/>
+    <w:lsdException w:name="Bibliography" w:semiHidden="1" w:uiPriority="37" w:unhideWhenUsed="1"/>
+    <w:lsdException w:name="TOC Heading" w:semiHidden="1" w:uiPriority="39" w:unhideWhenUsed="1" w:qFormat="1"/>
     <w:lsdException w:name="Plain Table 1" w:uiPriority="41"/>
     <w:lsdException w:name="Plain Table 2" w:uiPriority="42"/>
     <w:lsdException w:name="Plain Table 3" w:uiPriority="43"/>
@@ -1971,7 +1789,7 @@
     <w:lsdException w:name="Unresolved Mention" w:semiHidden="1" w:unhideWhenUsed="1"/>
     <w:lsdException w:name="Smart Link" w:semiHidden="1" w:unhideWhenUsed="1"/>
   </w:latentStyles>
-  <w:style w:type="paragraph" w:styleId="Normal" w:default="1">
+  <w:style w:type="paragraph" w:default="1" w:styleId="Normal">
     <w:name w:val="Normal"/>
     <w:qFormat/>
   </w:style>
@@ -1990,7 +1808,7 @@
       <w:outlineLvl w:val="0"/>
     </w:pPr>
     <w:rPr>
-      <w:rFonts w:asciiTheme="majorHAnsi" w:hAnsiTheme="majorHAnsi" w:eastAsiaTheme="majorEastAsia" w:cstheme="majorBidi"/>
+      <w:rFonts w:asciiTheme="majorHAnsi" w:eastAsiaTheme="majorEastAsia" w:hAnsiTheme="majorHAnsi" w:cstheme="majorBidi"/>
       <w:color w:val="0F4761" w:themeColor="accent1" w:themeShade="BF"/>
       <w:sz w:val="40"/>
       <w:szCs w:val="40"/>
@@ -2013,7 +1831,7 @@
       <w:outlineLvl w:val="1"/>
     </w:pPr>
     <w:rPr>
-      <w:rFonts w:asciiTheme="majorHAnsi" w:hAnsiTheme="majorHAnsi" w:eastAsiaTheme="majorEastAsia" w:cstheme="majorBidi"/>
+      <w:rFonts w:asciiTheme="majorHAnsi" w:eastAsiaTheme="majorEastAsia" w:hAnsiTheme="majorHAnsi" w:cstheme="majorBidi"/>
       <w:color w:val="0F4761" w:themeColor="accent1" w:themeShade="BF"/>
       <w:sz w:val="32"/>
       <w:szCs w:val="32"/>
@@ -2174,12 +1992,13 @@
       <w:color w:val="272727" w:themeColor="text1" w:themeTint="D8"/>
     </w:rPr>
   </w:style>
-  <w:style w:type="character" w:styleId="DefaultParagraphFont" w:default="1">
+  <w:style w:type="character" w:default="1" w:styleId="DefaultParagraphFont">
     <w:name w:val="Default Paragraph Font"/>
     <w:uiPriority w:val="1"/>
+    <w:semiHidden/>
     <w:unhideWhenUsed/>
   </w:style>
-  <w:style w:type="table" w:styleId="TableNormal" w:default="1">
+  <w:style w:type="table" w:default="1" w:styleId="TableNormal">
     <w:name w:val="Normal Table"/>
     <w:uiPriority w:val="99"/>
     <w:semiHidden/>
@@ -2194,26 +2013,26 @@
       </w:tblCellMar>
     </w:tblPr>
   </w:style>
-  <w:style w:type="numbering" w:styleId="NoList" w:default="1">
+  <w:style w:type="numbering" w:default="1" w:styleId="NoList">
     <w:name w:val="No List"/>
     <w:uiPriority w:val="99"/>
     <w:semiHidden/>
     <w:unhideWhenUsed/>
   </w:style>
-  <w:style w:type="character" w:styleId="Heading1Char" w:customStyle="1">
+  <w:style w:type="character" w:customStyle="1" w:styleId="Heading1Char">
     <w:name w:val="Heading 1 Char"/>
     <w:basedOn w:val="DefaultParagraphFont"/>
     <w:link w:val="Heading1"/>
     <w:uiPriority w:val="9"/>
     <w:rsid w:val="007C5FC7"/>
     <w:rPr>
-      <w:rFonts w:asciiTheme="majorHAnsi" w:hAnsiTheme="majorHAnsi" w:eastAsiaTheme="majorEastAsia" w:cstheme="majorBidi"/>
+      <w:rFonts w:asciiTheme="majorHAnsi" w:eastAsiaTheme="majorEastAsia" w:hAnsiTheme="majorHAnsi" w:cstheme="majorBidi"/>
       <w:color w:val="0F4761" w:themeColor="accent1" w:themeShade="BF"/>
       <w:sz w:val="40"/>
       <w:szCs w:val="40"/>
     </w:rPr>
   </w:style>
-  <w:style w:type="character" w:styleId="Heading2Char" w:customStyle="1">
+  <w:style w:type="character" w:customStyle="1" w:styleId="Heading2Char">
     <w:name w:val="Heading 2 Char"/>
     <w:basedOn w:val="DefaultParagraphFont"/>
     <w:link w:val="Heading2"/>
@@ -2221,13 +2040,13 @@
     <w:semiHidden/>
     <w:rsid w:val="007C5FC7"/>
     <w:rPr>
-      <w:rFonts w:asciiTheme="majorHAnsi" w:hAnsiTheme="majorHAnsi" w:eastAsiaTheme="majorEastAsia" w:cstheme="majorBidi"/>
+      <w:rFonts w:asciiTheme="majorHAnsi" w:eastAsiaTheme="majorEastAsia" w:hAnsiTheme="majorHAnsi" w:cstheme="majorBidi"/>
       <w:color w:val="0F4761" w:themeColor="accent1" w:themeShade="BF"/>
       <w:sz w:val="32"/>
       <w:szCs w:val="32"/>
     </w:rPr>
   </w:style>
-  <w:style w:type="character" w:styleId="Heading3Char" w:customStyle="1">
+  <w:style w:type="character" w:customStyle="1" w:styleId="Heading3Char">
     <w:name w:val="Heading 3 Char"/>
     <w:basedOn w:val="DefaultParagraphFont"/>
     <w:link w:val="Heading3"/>
@@ -2241,7 +2060,7 @@
       <w:szCs w:val="28"/>
     </w:rPr>
   </w:style>
-  <w:style w:type="character" w:styleId="Heading4Char" w:customStyle="1">
+  <w:style w:type="character" w:customStyle="1" w:styleId="Heading4Char">
     <w:name w:val="Heading 4 Char"/>
     <w:basedOn w:val="DefaultParagraphFont"/>
     <w:link w:val="Heading4"/>
@@ -2255,7 +2074,7 @@
       <w:color w:val="0F4761" w:themeColor="accent1" w:themeShade="BF"/>
     </w:rPr>
   </w:style>
-  <w:style w:type="character" w:styleId="Heading5Char" w:customStyle="1">
+  <w:style w:type="character" w:customStyle="1" w:styleId="Heading5Char">
     <w:name w:val="Heading 5 Char"/>
     <w:basedOn w:val="DefaultParagraphFont"/>
     <w:link w:val="Heading5"/>
@@ -2267,7 +2086,7 @@
       <w:color w:val="0F4761" w:themeColor="accent1" w:themeShade="BF"/>
     </w:rPr>
   </w:style>
-  <w:style w:type="character" w:styleId="Heading6Char" w:customStyle="1">
+  <w:style w:type="character" w:customStyle="1" w:styleId="Heading6Char">
     <w:name w:val="Heading 6 Char"/>
     <w:basedOn w:val="DefaultParagraphFont"/>
     <w:link w:val="Heading6"/>
@@ -2281,7 +2100,7 @@
       <w:color w:val="595959" w:themeColor="text1" w:themeTint="A6"/>
     </w:rPr>
   </w:style>
-  <w:style w:type="character" w:styleId="Heading7Char" w:customStyle="1">
+  <w:style w:type="character" w:customStyle="1" w:styleId="Heading7Char">
     <w:name w:val="Heading 7 Char"/>
     <w:basedOn w:val="DefaultParagraphFont"/>
     <w:link w:val="Heading7"/>
@@ -2293,7 +2112,7 @@
       <w:color w:val="595959" w:themeColor="text1" w:themeTint="A6"/>
     </w:rPr>
   </w:style>
-  <w:style w:type="character" w:styleId="Heading8Char" w:customStyle="1">
+  <w:style w:type="character" w:customStyle="1" w:styleId="Heading8Char">
     <w:name w:val="Heading 8 Char"/>
     <w:basedOn w:val="DefaultParagraphFont"/>
     <w:link w:val="Heading8"/>
@@ -2307,7 +2126,7 @@
       <w:color w:val="272727" w:themeColor="text1" w:themeTint="D8"/>
     </w:rPr>
   </w:style>
-  <w:style w:type="character" w:styleId="Heading9Char" w:customStyle="1">
+  <w:style w:type="character" w:customStyle="1" w:styleId="Heading9Char">
     <w:name w:val="Heading 9 Char"/>
     <w:basedOn w:val="DefaultParagraphFont"/>
     <w:link w:val="Heading9"/>
@@ -2332,21 +2151,21 @@
       <w:contextualSpacing/>
     </w:pPr>
     <w:rPr>
-      <w:rFonts w:asciiTheme="majorHAnsi" w:hAnsiTheme="majorHAnsi" w:eastAsiaTheme="majorEastAsia" w:cstheme="majorBidi"/>
+      <w:rFonts w:asciiTheme="majorHAnsi" w:eastAsiaTheme="majorEastAsia" w:hAnsiTheme="majorHAnsi" w:cstheme="majorBidi"/>
       <w:spacing w:val="-10"/>
       <w:kern w:val="28"/>
       <w:sz w:val="56"/>
       <w:szCs w:val="56"/>
     </w:rPr>
   </w:style>
-  <w:style w:type="character" w:styleId="TitleChar" w:customStyle="1">
+  <w:style w:type="character" w:customStyle="1" w:styleId="TitleChar">
     <w:name w:val="Title Char"/>
     <w:basedOn w:val="DefaultParagraphFont"/>
     <w:link w:val="Title"/>
     <w:uiPriority w:val="10"/>
     <w:rsid w:val="007C5FC7"/>
     <w:rPr>
-      <w:rFonts w:asciiTheme="majorHAnsi" w:hAnsiTheme="majorHAnsi" w:eastAsiaTheme="majorEastAsia" w:cstheme="majorBidi"/>
+      <w:rFonts w:asciiTheme="majorHAnsi" w:eastAsiaTheme="majorEastAsia" w:hAnsiTheme="majorHAnsi" w:cstheme="majorBidi"/>
       <w:spacing w:val="-10"/>
       <w:kern w:val="28"/>
       <w:sz w:val="56"/>
@@ -2374,7 +2193,7 @@
       <w:szCs w:val="28"/>
     </w:rPr>
   </w:style>
-  <w:style w:type="character" w:styleId="SubtitleChar" w:customStyle="1">
+  <w:style w:type="character" w:customStyle="1" w:styleId="SubtitleChar">
     <w:name w:val="Subtitle Char"/>
     <w:basedOn w:val="DefaultParagraphFont"/>
     <w:link w:val="Subtitle"/>
@@ -2406,7 +2225,7 @@
       <w:color w:val="404040" w:themeColor="text1" w:themeTint="BF"/>
     </w:rPr>
   </w:style>
-  <w:style w:type="character" w:styleId="QuoteChar" w:customStyle="1">
+  <w:style w:type="character" w:customStyle="1" w:styleId="QuoteChar">
     <w:name w:val="Quote Char"/>
     <w:basedOn w:val="DefaultParagraphFont"/>
     <w:link w:val="Quote"/>
@@ -2451,8 +2270,8 @@
     <w:rsid w:val="007C5FC7"/>
     <w:pPr>
       <w:pBdr>
-        <w:top w:val="single" w:color="0F4761" w:themeColor="accent1" w:themeShade="BF" w:sz="4" w:space="10"/>
-        <w:bottom w:val="single" w:color="0F4761" w:themeColor="accent1" w:themeShade="BF" w:sz="4" w:space="10"/>
+        <w:top w:val="single" w:sz="4" w:space="10" w:color="0F4761" w:themeColor="accent1" w:themeShade="BF"/>
+        <w:bottom w:val="single" w:sz="4" w:space="10" w:color="0F4761" w:themeColor="accent1" w:themeShade="BF"/>
       </w:pBdr>
       <w:spacing w:before="360" w:after="360"/>
       <w:ind w:left="864" w:right="864"/>
@@ -2464,7 +2283,7 @@
       <w:color w:val="0F4761" w:themeColor="accent1" w:themeShade="BF"/>
     </w:rPr>
   </w:style>
-  <w:style w:type="character" w:styleId="IntenseQuoteChar" w:customStyle="1">
+  <w:style w:type="character" w:customStyle="1" w:styleId="IntenseQuoteChar">
     <w:name w:val="Intense Quote Char"/>
     <w:basedOn w:val="DefaultParagraphFont"/>
     <w:link w:val="IntenseQuote"/>
@@ -2491,9 +2310,9 @@
     </w:rPr>
   </w:style>
   <w:style w:type="character" w:styleId="Hyperlink">
-    <w:uiPriority w:val="99"/>
     <w:name w:val="Hyperlink"/>
     <w:basedOn w:val="DefaultParagraphFont"/>
+    <w:uiPriority w:val="99"/>
     <w:unhideWhenUsed/>
     <w:rsid w:val="468DB1CC"/>
     <w:rPr>
@@ -2502,58 +2321,63 @@
     </w:rPr>
   </w:style>
   <w:style w:type="paragraph" w:styleId="Header">
-    <w:uiPriority w:val="99"/>
     <w:name w:val="header"/>
     <w:basedOn w:val="Normal"/>
+    <w:uiPriority w:val="99"/>
     <w:unhideWhenUsed/>
     <w:rsid w:val="468DB1CC"/>
     <w:pPr>
       <w:tabs>
-        <w:tab w:val="center" w:leader="none" w:pos="4680"/>
-        <w:tab w:val="right" w:leader="none" w:pos="9360"/>
+        <w:tab w:val="center" w:pos="4680"/>
+        <w:tab w:val="right" w:pos="9360"/>
       </w:tabs>
       <w:spacing w:after="0" w:line="240" w:lineRule="auto"/>
     </w:pPr>
   </w:style>
   <w:style w:type="paragraph" w:styleId="Footer">
-    <w:uiPriority w:val="99"/>
     <w:name w:val="footer"/>
     <w:basedOn w:val="Normal"/>
+    <w:uiPriority w:val="99"/>
     <w:unhideWhenUsed/>
     <w:rsid w:val="468DB1CC"/>
     <w:pPr>
       <w:tabs>
-        <w:tab w:val="center" w:leader="none" w:pos="4680"/>
-        <w:tab w:val="right" w:leader="none" w:pos="9360"/>
+        <w:tab w:val="center" w:pos="4680"/>
+        <w:tab w:val="right" w:pos="9360"/>
       </w:tabs>
       <w:spacing w:after="0" w:line="240" w:lineRule="auto"/>
     </w:pPr>
   </w:style>
-  <w:style xmlns:w="http://schemas.openxmlformats.org/wordprocessingml/2006/main" w:type="table" w:styleId="TableGrid">
-    <w:name xmlns:w="http://schemas.openxmlformats.org/wordprocessingml/2006/main" w:val="Table Grid"/>
-    <w:basedOn xmlns:w="http://schemas.openxmlformats.org/wordprocessingml/2006/main" w:val="TableNormal"/>
-    <w:uiPriority xmlns:w="http://schemas.openxmlformats.org/wordprocessingml/2006/main" w:val="59"/>
-    <w:rsid xmlns:w="http://schemas.openxmlformats.org/wordprocessingml/2006/main" w:val="00FB4123"/>
-    <w:pPr xmlns:w="http://schemas.openxmlformats.org/wordprocessingml/2006/main">
+  <w:style w:type="table" w:styleId="TableGrid">
+    <w:name w:val="Table Grid"/>
+    <w:basedOn w:val="TableNormal"/>
+    <w:uiPriority w:val="59"/>
+    <w:rsid w:val="00FB4123"/>
+    <w:pPr>
       <w:spacing w:after="0" w:line="240" w:lineRule="auto"/>
     </w:pPr>
-    <w:tblPr xmlns:w="http://schemas.openxmlformats.org/wordprocessingml/2006/main">
-      <w:tblInd w:w="0" w:type="dxa"/>
+    <w:tblPr>
       <w:tblBorders>
-        <w:top w:val="single" w:color="000000" w:themeColor="text1" w:sz="4" w:space="0"/>
-        <w:left w:val="single" w:color="000000" w:themeColor="text1" w:sz="4" w:space="0"/>
-        <w:bottom w:val="single" w:color="000000" w:themeColor="text1" w:sz="4" w:space="0"/>
-        <w:right w:val="single" w:color="000000" w:themeColor="text1" w:sz="4" w:space="0"/>
-        <w:insideH w:val="single" w:color="000000" w:themeColor="text1" w:sz="4" w:space="0"/>
-        <w:insideV w:val="single" w:color="000000" w:themeColor="text1" w:sz="4" w:space="0"/>
+        <w:top w:val="single" w:sz="4" w:space="0" w:color="000000" w:themeColor="text1"/>
+        <w:left w:val="single" w:sz="4" w:space="0" w:color="000000" w:themeColor="text1"/>
+        <w:bottom w:val="single" w:sz="4" w:space="0" w:color="000000" w:themeColor="text1"/>
+        <w:right w:val="single" w:sz="4" w:space="0" w:color="000000" w:themeColor="text1"/>
+        <w:insideH w:val="single" w:sz="4" w:space="0" w:color="000000" w:themeColor="text1"/>
+        <w:insideV w:val="single" w:sz="4" w:space="0" w:color="000000" w:themeColor="text1"/>
       </w:tblBorders>
-      <w:tblCellMar>
-        <w:top w:w="0" w:type="dxa"/>
-        <w:left w:w="108" w:type="dxa"/>
-        <w:bottom w:w="0" w:type="dxa"/>
-        <w:right w:w="108" w:type="dxa"/>
-      </w:tblCellMar>
     </w:tblPr>
+  </w:style>
+  <w:style w:type="character" w:styleId="FollowedHyperlink">
+    <w:name w:val="FollowedHyperlink"/>
+    <w:basedOn w:val="DefaultParagraphFont"/>
+    <w:uiPriority w:val="99"/>
+    <w:semiHidden/>
+    <w:unhideWhenUsed/>
+    <w:rsid w:val="00FC69D3"/>
+    <w:rPr>
+      <w:color w:val="96607D" w:themeColor="followedHyperlink"/>
+      <w:u w:val="single"/>
+    </w:rPr>
   </w:style>
 </w:styles>
 </file>

</xml_diff>

<commit_message>
All new models + textures added and implemented
</commit_message>
<xml_diff>
--- a/Documentation/Initial Report.docx
+++ b/Documentation/Initial Report.docx
@@ -32,15 +32,7 @@
         <w:t xml:space="preserve">Optimised Developer Tool - </w:t>
       </w:r>
       <w:r>
-        <w:t xml:space="preserve">An OpenGL project utilizing at least 2 of the techniques in the following categories: Geometry shaders, Shadows, Noise, Particle system and animation, Image processing techniques, </w:t>
-      </w:r>
-      <w:proofErr w:type="gramStart"/>
-      <w:r>
-        <w:t>Physically</w:t>
-      </w:r>
-      <w:proofErr w:type="gramEnd"/>
-      <w:r>
-        <w:t xml:space="preserve"> based reflection model (PBR).</w:t>
+        <w:t>An OpenGL project utilizing at least 2 of the techniques in the following categories: Geometry shaders, Shadows, Noise, Particle system and animation, Image processing techniques, Physically based reflection model (PBR).</w:t>
       </w:r>
     </w:p>
     <w:p>
@@ -104,31 +96,13 @@
       </w:r>
     </w:p>
     <w:p>
-      <w:proofErr w:type="gramStart"/>
-      <w:r>
-        <w:t>So</w:t>
-      </w:r>
-      <w:proofErr w:type="gramEnd"/>
-      <w:r>
-        <w:t xml:space="preserve"> this is basically saying that 10 marks from 40 then 2 10 marks from this and </w:t>
-      </w:r>
-      <w:proofErr w:type="gramStart"/>
-      <w:r>
-        <w:t>its</w:t>
-      </w:r>
-      <w:proofErr w:type="gramEnd"/>
-      <w:r>
-        <w:t xml:space="preserve"> broken down like so</w:t>
-      </w:r>
-    </w:p>
-    <w:p>
-      <w:proofErr w:type="gramStart"/>
-      <w:r>
-        <w:t>So</w:t>
-      </w:r>
-      <w:proofErr w:type="gramEnd"/>
-      <w:r>
-        <w:t xml:space="preserve"> in total 3 - ^^^</w:t>
+      <w:r>
+        <w:t>So this is basically saying that 10 marks from 40 then 2 10 marks from this and its broken down like so</w:t>
+      </w:r>
+    </w:p>
+    <w:p>
+      <w:r>
+        <w:t>So in total 3 - ^^^</w:t>
       </w:r>
     </w:p>
     <w:p/>
@@ -411,15 +385,7 @@
       </w:r>
       <w:proofErr w:type="spellEnd"/>
       <w:r>
-        <w:t xml:space="preserve"> am using the gun for </w:t>
-      </w:r>
-      <w:proofErr w:type="gramStart"/>
-      <w:r>
-        <w:t>game</w:t>
-      </w:r>
-      <w:proofErr w:type="gramEnd"/>
-      <w:r>
-        <w:t xml:space="preserve"> then maybe make the can shiny instead</w:t>
+        <w:t xml:space="preserve"> am using the gun for game then maybe make the can shiny instead</w:t>
       </w:r>
     </w:p>
     <w:p>
@@ -553,19 +519,7 @@
           <w:rPr>
             <w:rStyle w:val="Hyperlink"/>
           </w:rPr>
-          <w:t>https://www.</w:t>
-        </w:r>
-        <w:r>
-          <w:rPr>
-            <w:rStyle w:val="Hyperlink"/>
-          </w:rPr>
-          <w:t>t</w:t>
-        </w:r>
-        <w:r>
-          <w:rPr>
-            <w:rStyle w:val="Hyperlink"/>
-          </w:rPr>
-          <w:t>urbosquid.com/3d-models/wall-747378</w:t>
+          <w:t>https://www.turbosquid.com/3d-models/wall-747378</w:t>
         </w:r>
       </w:hyperlink>
     </w:p>
@@ -700,7 +654,21 @@
         <w:t xml:space="preserve">Load the assets , Load the textures, Movement </w:t>
       </w:r>
     </w:p>
-    <w:p/>
+    <w:p>
+      <w:r>
+        <w:t>Assets and textures in</w:t>
+      </w:r>
+    </w:p>
+    <w:p>
+      <w:r>
+        <w:t>Now to figure out how I am going to implement this new stuff, either start with just the models from beginning – or try myself to follow vids and patch up</w:t>
+      </w:r>
+    </w:p>
+    <w:p>
+      <w:r>
+        <w:t xml:space="preserve">First attempt – Try myself </w:t>
+      </w:r>
+    </w:p>
     <w:p/>
     <w:p/>
     <w:p>

</xml_diff>

<commit_message>
Removed Fog and spotlight
</commit_message>
<xml_diff>
--- a/Documentation/Initial Report.docx
+++ b/Documentation/Initial Report.docx
@@ -12,6 +12,15 @@
           <w:szCs w:val="28"/>
         </w:rPr>
       </w:pPr>
+      <w:r>
+        <w:rPr>
+          <w:b/>
+          <w:bCs/>
+          <w:sz w:val="28"/>
+          <w:szCs w:val="28"/>
+        </w:rPr>
+        <w:t xml:space="preserve"> </w:t>
+      </w:r>
       <w:r>
         <w:rPr>
           <w:b/>
@@ -341,6 +350,85 @@
     </w:p>
     <w:p>
       <w:pPr>
+        <w:pStyle w:val="ListParagraph"/>
+        <w:numPr>
+          <w:ilvl w:val="0"/>
+          <w:numId w:val="1"/>
+        </w:numPr>
+      </w:pPr>
+      <w:r>
+        <w:t>Particle fountine?</w:t>
+      </w:r>
+      <w:r>
+        <w:t xml:space="preserve"> </w:t>
+      </w:r>
+    </w:p>
+    <w:p>
+      <w:pPr>
+        <w:pStyle w:val="ListParagraph"/>
+      </w:pPr>
+    </w:p>
+    <w:p>
+      <w:pPr>
+        <w:pStyle w:val="ListParagraph"/>
+        <w:numPr>
+          <w:ilvl w:val="0"/>
+          <w:numId w:val="1"/>
+        </w:numPr>
+      </w:pPr>
+      <w:r>
+        <w:t>6-3 : bloodL:</w:t>
+      </w:r>
+    </w:p>
+    <w:p>
+      <w:pPr>
+        <w:pStyle w:val="ListParagraph"/>
+      </w:pPr>
+    </w:p>
+    <w:p>
+      <w:pPr>
+        <w:pStyle w:val="ListParagraph"/>
+      </w:pPr>
+      <w:r>
+        <w:drawing>
+          <wp:inline distT="0" distB="0" distL="0" distR="0" wp14:anchorId="15A24520" wp14:editId="144E9B09">
+            <wp:extent cx="5731510" cy="4474845"/>
+            <wp:effectExtent l="0" t="0" r="2540" b="1905"/>
+            <wp:docPr id="2097236077" name="Picture 1" descr="A blue rings floating in the air&#10;&#10;AI-generated content may be incorrect."/>
+            <wp:cNvGraphicFramePr>
+              <a:graphicFrameLocks xmlns:a="http://schemas.openxmlformats.org/drawingml/2006/main" noChangeAspect="1"/>
+            </wp:cNvGraphicFramePr>
+            <a:graphic xmlns:a="http://schemas.openxmlformats.org/drawingml/2006/main">
+              <a:graphicData uri="http://schemas.openxmlformats.org/drawingml/2006/picture">
+                <pic:pic xmlns:pic="http://schemas.openxmlformats.org/drawingml/2006/picture">
+                  <pic:nvPicPr>
+                    <pic:cNvPr id="2097236077" name="Picture 1" descr="A blue rings floating in the air&#10;&#10;AI-generated content may be incorrect."/>
+                    <pic:cNvPicPr/>
+                  </pic:nvPicPr>
+                  <pic:blipFill>
+                    <a:blip r:embed="rId9"/>
+                    <a:stretch>
+                      <a:fillRect/>
+                    </a:stretch>
+                  </pic:blipFill>
+                  <pic:spPr>
+                    <a:xfrm>
+                      <a:off x="0" y="0"/>
+                      <a:ext cx="5731510" cy="4474845"/>
+                    </a:xfrm>
+                    <a:prstGeom prst="rect">
+                      <a:avLst/>
+                    </a:prstGeom>
+                  </pic:spPr>
+                </pic:pic>
+              </a:graphicData>
+            </a:graphic>
+          </wp:inline>
+        </w:drawing>
+      </w:r>
+    </w:p>
+    <w:p>
+      <w:pPr>
         <w:rPr>
           <w:b/>
           <w:bCs/>
@@ -377,15 +465,7 @@
     </w:p>
     <w:p>
       <w:r>
-        <w:t xml:space="preserve">If </w:t>
-      </w:r>
-      <w:proofErr w:type="spellStart"/>
-      <w:r>
-        <w:t>i</w:t>
-      </w:r>
-      <w:proofErr w:type="spellEnd"/>
-      <w:r>
-        <w:t xml:space="preserve"> am using the gun for game then maybe make the can shiny instead</w:t>
+        <w:t>If i am using the gun for game then maybe make the can shiny instead</w:t>
       </w:r>
     </w:p>
     <w:p>
@@ -410,23 +490,8 @@
     <w:p/>
     <w:p>
       <w:r>
-        <w:t>You may use any from any sources (i.e. “</w:t>
-      </w:r>
-      <w:proofErr w:type="spellStart"/>
-      <w:r>
-        <w:t>gamedev</w:t>
-      </w:r>
-      <w:proofErr w:type="spellEnd"/>
-      <w:r>
-        <w:t xml:space="preserve">”, Nvidia, </w:t>
-      </w:r>
-      <w:proofErr w:type="spellStart"/>
-      <w:r>
-        <w:t>Shadertoy</w:t>
-      </w:r>
-      <w:proofErr w:type="spellEnd"/>
-      <w:r>
-        <w:t xml:space="preserve">) of program code which you can adapt. But you must tell us what you started with and what you have done to it. If this is not done you risk failing the assignment. You can also use a wider range of 3rd party libraries this time around, e.g. audio, noise, UI. You could also use a physics library such as a </w:t>
+        <w:lastRenderedPageBreak/>
+        <w:t xml:space="preserve">You may use any from any sources (i.e. “gamedev”, Nvidia, Shadertoy) of program code which you can adapt. But you must tell us what you started with and what you have done to it. If this is not done you risk failing the assignment. You can also use a wider range of 3rd party libraries this time around, e.g. audio, noise, UI. You could also use a physics library such as a </w:t>
       </w:r>
       <w:r>
         <w:rPr>
@@ -480,7 +545,7 @@
       <w:r>
         <w:t xml:space="preserve">Table - </w:t>
       </w:r>
-      <w:hyperlink r:id="rId9">
+      <w:hyperlink r:id="rId10">
         <w:r>
           <w:rPr>
             <w:rStyle w:val="Hyperlink"/>
@@ -496,7 +561,7 @@
       <w:r>
         <w:t xml:space="preserve"> - </w:t>
       </w:r>
-      <w:hyperlink r:id="rId10">
+      <w:hyperlink r:id="rId11">
         <w:r>
           <w:rPr>
             <w:rStyle w:val="Hyperlink"/>
@@ -514,7 +579,7 @@
       <w:r>
         <w:t xml:space="preserve">Wall - </w:t>
       </w:r>
-      <w:hyperlink r:id="rId11">
+      <w:hyperlink r:id="rId12">
         <w:r>
           <w:rPr>
             <w:rStyle w:val="Hyperlink"/>
@@ -530,7 +595,7 @@
       <w:r>
         <w:t xml:space="preserve"> – Fallout gun -  </w:t>
       </w:r>
-      <w:hyperlink r:id="rId12">
+      <w:hyperlink r:id="rId13">
         <w:r>
           <w:rPr>
             <w:rStyle w:val="Hyperlink"/>
@@ -546,7 +611,7 @@
       <w:r>
         <w:t xml:space="preserve"> </w:t>
       </w:r>
-      <w:hyperlink r:id="rId13">
+      <w:hyperlink r:id="rId14">
         <w:r>
           <w:rPr>
             <w:rStyle w:val="Hyperlink"/>
@@ -559,7 +624,7 @@
       <w:r>
         <w:t xml:space="preserve">This could be in background - </w:t>
       </w:r>
-      <w:hyperlink r:id="rId14">
+      <w:hyperlink r:id="rId15">
         <w:r>
           <w:rPr>
             <w:rStyle w:val="Hyperlink"/>
@@ -587,15 +652,7 @@
     </w:p>
     <w:p>
       <w:r>
-        <w:t xml:space="preserve">Probably </w:t>
-      </w:r>
-      <w:proofErr w:type="spellStart"/>
-      <w:r>
-        <w:t>irrklang</w:t>
-      </w:r>
-      <w:proofErr w:type="spellEnd"/>
-      <w:r>
-        <w:t xml:space="preserve"> </w:t>
+        <w:t xml:space="preserve">Probably irrklang </w:t>
       </w:r>
     </w:p>
     <w:p/>
@@ -684,6 +741,7 @@
         <w:rPr>
           <w:noProof/>
         </w:rPr>
+        <w:lastRenderedPageBreak/>
         <w:drawing>
           <wp:inline distT="0" distB="0" distL="0" distR="0" wp14:anchorId="795E02D6" wp14:editId="61CCEAC7">
             <wp:extent cx="5731510" cy="1911985"/>
@@ -700,7 +758,7 @@
                     <pic:cNvPicPr/>
                   </pic:nvPicPr>
                   <pic:blipFill>
-                    <a:blip r:embed="rId15"/>
+                    <a:blip r:embed="rId16"/>
                     <a:stretch>
                       <a:fillRect/>
                     </a:stretch>
@@ -738,7 +796,6 @@
         <w:rPr>
           <w:noProof/>
         </w:rPr>
-        <w:lastRenderedPageBreak/>
         <w:drawing>
           <wp:inline distT="0" distB="0" distL="0" distR="0" wp14:anchorId="6A563B8B" wp14:editId="10F7843D">
             <wp:extent cx="5731510" cy="5475605"/>
@@ -757,7 +814,7 @@
                     </pic:cNvPicPr>
                   </pic:nvPicPr>
                   <pic:blipFill>
-                    <a:blip r:embed="rId16">
+                    <a:blip r:embed="rId17">
                       <a:extLst>
                         <a:ext uri="{28A0092B-C50C-407E-A947-70E740481C1C}">
                           <a14:useLocalDpi xmlns:a14="http://schemas.microsoft.com/office/drawing/2010/main" val="0"/>
@@ -790,8 +847,8 @@
       </w:r>
     </w:p>
     <w:sectPr>
-      <w:headerReference w:type="default" r:id="rId17"/>
-      <w:footerReference w:type="default" r:id="rId18"/>
+      <w:headerReference w:type="default" r:id="rId18"/>
+      <w:footerReference w:type="default" r:id="rId19"/>
       <w:pgSz w:w="11906" w:h="16838"/>
       <w:pgMar w:top="1440" w:right="1440" w:bottom="1440" w:left="1440" w:header="708" w:footer="708" w:gutter="0"/>
       <w:cols w:space="708"/>

</xml_diff>

<commit_message>
Trying to set up Gaussian Blur
</commit_message>
<xml_diff>
--- a/Documentation/Initial Report.docx
+++ b/Documentation/Initial Report.docx
@@ -357,7 +357,15 @@
         </w:numPr>
       </w:pPr>
       <w:r>
-        <w:t>Particle fountine?</w:t>
+        <w:t xml:space="preserve">Particle </w:t>
+      </w:r>
+      <w:proofErr w:type="spellStart"/>
+      <w:r>
+        <w:t>fountine</w:t>
+      </w:r>
+      <w:proofErr w:type="spellEnd"/>
+      <w:r>
+        <w:t>?</w:t>
       </w:r>
       <w:r>
         <w:t xml:space="preserve"> </w:t>
@@ -377,7 +385,15 @@
         </w:numPr>
       </w:pPr>
       <w:r>
-        <w:t>6-3 : bloodL:</w:t>
+        <w:t xml:space="preserve">6-3 : </w:t>
+      </w:r>
+      <w:proofErr w:type="spellStart"/>
+      <w:r>
+        <w:t>bloodL</w:t>
+      </w:r>
+      <w:proofErr w:type="spellEnd"/>
+      <w:r>
+        <w:t>:</w:t>
       </w:r>
     </w:p>
     <w:p>
@@ -390,6 +406,9 @@
         <w:pStyle w:val="ListParagraph"/>
       </w:pPr>
       <w:r>
+        <w:rPr>
+          <w:noProof/>
+        </w:rPr>
         <w:drawing>
           <wp:inline distT="0" distB="0" distL="0" distR="0" wp14:anchorId="15A24520" wp14:editId="144E9B09">
             <wp:extent cx="5731510" cy="4474845"/>
@@ -465,7 +484,15 @@
     </w:p>
     <w:p>
       <w:r>
-        <w:t>If i am using the gun for game then maybe make the can shiny instead</w:t>
+        <w:t xml:space="preserve">If </w:t>
+      </w:r>
+      <w:proofErr w:type="spellStart"/>
+      <w:r>
+        <w:t>i</w:t>
+      </w:r>
+      <w:proofErr w:type="spellEnd"/>
+      <w:r>
+        <w:t xml:space="preserve"> am using the gun for game then maybe make the can shiny instead</w:t>
       </w:r>
     </w:p>
     <w:p>
@@ -491,13 +518,49 @@
     <w:p>
       <w:r>
         <w:lastRenderedPageBreak/>
-        <w:t xml:space="preserve">You may use any from any sources (i.e. “gamedev”, Nvidia, Shadertoy) of program code which you can adapt. But you must tell us what you started with and what you have done to it. If this is not done you risk failing the assignment. You can also use a wider range of 3rd party libraries this time around, e.g. audio, noise, UI. You could also use a physics library such as a </w:t>
+        <w:t>You may use any from any sources (i.e. “</w:t>
+      </w:r>
+      <w:proofErr w:type="spellStart"/>
+      <w:r>
+        <w:t>gamedev</w:t>
+      </w:r>
+      <w:proofErr w:type="spellEnd"/>
+      <w:r>
+        <w:t xml:space="preserve">”, Nvidia, </w:t>
+      </w:r>
+      <w:proofErr w:type="spellStart"/>
+      <w:r>
+        <w:t>Shadertoy</w:t>
+      </w:r>
+      <w:proofErr w:type="spellEnd"/>
+      <w:r>
+        <w:t xml:space="preserve">) of program code which you can adapt. But you must tell us what you started with and what you have done to it. If this is not done you risk failing the assignment. You can also use a wider range of 3rd party libraries this time around, e.g. audio, noise, UI. You could also use a physics library such as a </w:t>
       </w:r>
       <w:r>
         <w:rPr>
           <w:highlight w:val="yellow"/>
         </w:rPr>
         <w:t>Bullet or PhysX.</w:t>
+      </w:r>
+    </w:p>
+    <w:p>
+      <w:pPr>
+        <w:rPr>
+          <w:highlight w:val="yellow"/>
+        </w:rPr>
+      </w:pPr>
+    </w:p>
+    <w:p>
+      <w:pPr>
+        <w:rPr>
+          <w:highlight w:val="yellow"/>
+        </w:rPr>
+      </w:pPr>
+      <w:r>
+        <w:rPr>
+          <w:highlight w:val="yellow"/>
+        </w:rPr>
+        <w:t>Blur vision like you been nuked</w:t>
       </w:r>
     </w:p>
     <w:p>
@@ -652,7 +715,15 @@
     </w:p>
     <w:p>
       <w:r>
-        <w:t xml:space="preserve">Probably irrklang </w:t>
+        <w:t xml:space="preserve">Probably </w:t>
+      </w:r>
+      <w:proofErr w:type="spellStart"/>
+      <w:r>
+        <w:t>irrklang</w:t>
+      </w:r>
+      <w:proofErr w:type="spellEnd"/>
+      <w:r>
+        <w:t xml:space="preserve"> </w:t>
       </w:r>
     </w:p>
     <w:p/>
@@ -741,7 +812,6 @@
         <w:rPr>
           <w:noProof/>
         </w:rPr>
-        <w:lastRenderedPageBreak/>
         <w:drawing>
           <wp:inline distT="0" distB="0" distL="0" distR="0" wp14:anchorId="795E02D6" wp14:editId="61CCEAC7">
             <wp:extent cx="5731510" cy="1911985"/>

</xml_diff>